<commit_message>
Proofcheck Flour Play Filipino: SIGNIFICANT (30 edits)
Co-Authored-By: Claude Opus 5.5 <noreply@anthropic.com>
Claude-Session: https://claude.ai/code/session_012Cm8JxdqzjuttdUSdkQCUg
</commit_message>
<xml_diff>
--- a/translated/corrected/Flour Play - ASSEMBLED - FORMATTED_Filipino.docx
+++ b/translated/corrected/Flour Play - ASSEMBLED - FORMATTED_Filipino.docx
@@ -120,13 +120,13 @@
     <w:p/>
     <w:p>
       <w:r>
-        <w:t>Bagong harina. Bagong tubig. Isang hiniram na timbangan. Maasim pa rin. Pagdating ng Huwebes, nakatayo si Greta sa sarili niyang panaderya at sinabi kay Jessica Claus na tuluyan na raw palang kinalimutan ng kanyang mga kamay ang paggawa nito.</w:t>
-      </w:r>
-    </w:p>
-    <w:p/>
-    <w:p>
-      <w:r>
-        <w:t>Pagkatapos, may lumipad na ladrilyo sa bintana, at may nakasulat na salita sa pulang pintura sa pader kung saan makikita at babasahin ito ng bawat batang dumadaan sa Evergreen Avenue.</w:t>
+        <w:t>Bagong harina. Bagong tubig. Isang hiniram na timbangan. Maasim pa rin. Pagdating ng Huwebes, nakatayo si Greta sa sarili niyang panaderya at sinasabi kay Jessica Claus na tuluyan na raw palang kinalimutan ng kanyang mga kamay ang paggawa nito.</w:t>
+      </w:r>
+    </w:p>
+    <w:p/>
+    <w:p>
+      <w:r>
+        <w:t>Pagkatapos, may ladrilyong lumulusot sa bintana, at may nakasulat na salita sa pulang pintura sa pader kung saan makikita at babasahin ito ng bawat batang dumadaan sa Evergreen Avenue.</w:t>
       </w:r>
     </w:p>
     <w:p/>
@@ -197,7 +197,7 @@
     <w:p/>
     <w:p>
       <w:r>
-        <w:t xml:space="preserve">Tumawa si Dot ng kaniyang maikli at tuyong tawa mula sa kabilang panig ng bilog, nang hindi tumitingin mula sa kaniyang korona, na may kalakihang kalahati na kaysa sa sinuman at dalawang beses ang kapal. “Inaabangan na niya ang iyong sikreto mula pa noong araw na pumasok ka. Inaabangan din niya ang sa akin noong dekada otsenta o kung kailan man.” Si Dot ay matipuno at ubanin at marami nang nasabi sa napakakaunting salita. Dekada na siyang gumagawa ng mga korona sa tindahang iyon. Makikita iyon sa kaniyang mga kamay. Hindi kailanman tumigil at hindi kailanman nagkamali.</w:t>
+        <w:t xml:space="preserve">Tumawa si Dot ng kaniyang maikli at tuyong tawa mula sa kabilang panig ng bilog, nang hindi tumitingin mula sa kaniyang korona, na mas malaki nang kalahati kaysa sa sinuman at dalawang beses ang kapal. “Inaabangan na niya ang iyong sikreto mula pa noong araw na pumasok ka. Inaabangan din niya ang sa akin noong dekada otsenta o kung kailan man.” Si Dot ay matipuno at ubanin at marami nang nasabi sa napakakaunting salita. Dekada na siyang gumagawa ng mga korona sa tindahang iyon. Makikita iyon sa kaniyang mga kamay. Hindi kailanman tumigil at hindi kailanman nagkamali.</w:t>
       </w:r>
     </w:p>
     <w:p/>
@@ -2738,7 +2738,7 @@
     <w:p/>
     <w:p>
       <w:r>
-        <w:t xml:space="preserve">“Hindi ko masabi kung sino. Sasabihin ko sa iyo ito, dahil tumatak sa lalamunan ko.” Tumango siya pabalik sa dilaw na papel. “Karamihan sa mga reklamong natatanggap ko ay mula sa isang baliw na kapitbahay o isang maarte na kostumer, at mababasa mo iyon. </w:t>
+        <w:t xml:space="preserve">“Hindi ko masabi kung sino. Sasabihin ko sa inyo ito, dahil tumatak sa lalamunan ko.” Tumango siya pabalik sa dilaw na papel. “Karamihan sa mga reklamong natatanggap ko ay mula sa isang baliw na kapitbahay o isang maarte na kostumer, at mababasa mo iyon. </w:t>
       </w:r>
       <w:r>
         <w:rPr>
@@ -2840,7 +2840,7 @@
     <w:p/>
     <w:p>
       <w:r>
-        <w:t xml:space="preserve">Karamihan ay nagkaisa. Dumating si Kelly bago ang dilim na may mukha na parang panahon, binasa ang abiso, nagsabi ng isang salita na hindi ko uulitin, at dumeretso sa loob upang makipag-upo kay Greta. Kinuha ni Hal ang kahon ng mga tinapay para sa bariles. “Walang mas malinis na kusina sa kondadong ito,” mahinang wika niya sa sinumang nakatayo sa malapit. Ang kaniyang mga kaibigan ay pumalibot sa kaniya nang hindi na kailangang hilingin.</w:t>
+        <w:t xml:space="preserve">Karamihan ay nagkaisa. Dumating si Kelly bago ang dilim na nakasimangot na parang nagbabadyang bagyo, binasa ang abiso, nagsabi ng isang salita na hindi ko uulitin, at dumeretso sa loob upang makipag-upo kay Greta. Kinuha ni Hal ang kahon ng mga tinapay para sa bariles. “Walang mas malinis na kusina sa kondadong ito,” mahinang wika niya sa sinumang nakatayo sa malapit. Ang kaniyang mga kaibigan ay pumalibot sa kaniya nang hindi na kailangang hilingin.</w:t>
       </w:r>
     </w:p>
     <w:p/>
@@ -2968,7 +2968,7 @@
     <w:p/>
     <w:p>
       <w:r>
-        <w:t>Si Anne Doucette ay mas bata kaysa sa aking inihanda. Mas pagod din, kaysa sa nararapat sa sinumang babae sa kanyang edad. Malinis na malinis ang kanyang bahay. Wala masyadong laman ang silid. Ang bawat piraso ay nagniningning. Isang belen ang nakatayo na sa mantel kahit na ang Nobyembre ay wala pang isang linggo ang tanda. Maliliit at inukit na pigura na naging makinis sa paghawak, ang pintura ay nawala sa mga pastol. Maagang inilatag.</w:t>
+        <w:t>Si Anne Doucette ay mas bata kaysa sa aking inihanda. Mas pagod din, kaysa sa nararapat sa sinumang babae sa kanyang edad. Malinis na malinis ang kanyang bahay. Wala masyadong laman ang silid. Ang bawat piraso ay nagniningning. Isang belen ang nakatayo na sa patungan sa ibabaw ng tsimenea kahit na ang Nobyembre ay wala pang isang linggo ang tanda. Maliliit at inukit na pigura na naging makinis sa paghawak, ang pintura ay nawala sa mga pastol. Maagang inilatag.</w:t>
       </w:r>
     </w:p>
     <w:p/>
@@ -3204,7 +3204,7 @@
     <w:p/>
     <w:p>
       <w:r>
-        <w:t xml:space="preserve">“Hindi ko mababanggit ang pangalan ng tatak mula sa aking mesa. Isa akong beterinaryo, hindi isang laboratoryo sa Portland. Ngunit masasabi ko sa inyo ang pamilya nito.” Ibinaba niya ang garapon at hinarap ako nang diretso. “Ito ay isang maasim na base. Pinatuyong asido, lactic at acetic. Painitin mo at may suka sa usok; iyon ang acetic. Ang lactic naman ay ang parehong asido na nagpapaasim ng gatas. Binibili ito nang tig-iisang sako ng mga pakyawang panaderya ng tinapay upang bigyan ang rye at mga deli loaf ng lasang parang sourdough nang walang starter. Walang magiging silbi nito ang isang pagawaan ng pastry.” Hinawakan niyang muli ang garapon. “Sa isang rye, sa tamang dami, wala itong masamang epekto. Hindi ito dami para sa rye, at hindi ito rye. Ito ang dami na gagamitin mo para sadyang sirain ang sandaang libra ng harina. Sampung beses ng kailanman ay ilalagay ng sinumang panadero ng tinapay.”</w:t>
+        <w:t xml:space="preserve">“Hindi ko mababanggit ang pangalan ng tatak mula sa aking mesa. Isa akong beterinaryo, hindi isang laboratoryo sa Portland. Ngunit masasabi ko sa inyo ang pamilya nito.” Ibinaba niya ang garapon at hinarap ako nang diretso. “Ito ay isang maasim na base. Pinatuyong asido, lactic at acetic. Painitin mo at may suka sa usok; iyon ang acetic. Ang lactic naman ay ang parehong asido na nagpapaasim ng gatas. Binibili ito nang kada sako ng mga pakyawang panaderya ng tinapay upang bigyan ang rye at mga deli loaf ng lasang parang sourdough nang walang starter. Walang magiging silbi nito ang isang pagawaan ng pastry.” Hinawakan niyang muli ang garapon. “Sa isang rye, sa tamang dami, wala itong masamang epekto. Hindi ito dami para sa rye, at hindi ito rye. Ito ang dami na gagamitin mo para sadyang sirain ang sandaang libra ng harina. Sampung beses ng dami na kailanman ay ilalagay ng sinumang panadero ng tinapay.”</w:t>
       </w:r>
     </w:p>
     <w:p/>
@@ -3228,7 +3228,7 @@
     <w:p/>
     <w:p>
       <w:r>
-        <w:t>Lumabas ako sa lamig bitbit ang garapon sa loob ng aking amerikana at ang lahat ay nagbago sa aking isipan. Sumunod si Pip sa akin pababa sa baitang at nanatili sa aking pinakalayong bahagi, malayo sa bulsa na kinaroroonan ng garapon.</w:t>
+        <w:t>Lumabas ako sa lamig bitbit ang garapon sa loob ng aking amerikana at ang lahat ay nagbago sa aking isipan. Sumunod si Pip sa akin pababa sa baitang at nanatili sa kabilang tabi ko, malayo sa bulsa na kinaroroonan ng garapon.</w:t>
       </w:r>
     </w:p>
     <w:p/>
@@ -3377,7 +3377,7 @@
     <w:p/>
     <w:p>
       <w:r>
-        <w:t xml:space="preserve">At maaabot ito. Iyon ang problema rito. Hindi ito kaha-de-yero. Isang pintuang kahoy sa pampublikong eskinita na nakabukas nang kalahati sa bawat umaga hanggang sa insidente ng ladrilyo. Sinumang nakakaalam sa mga oras ng isang panadero at may dahilan upang mapunta sa bakurang iyon bago mag-umaga ay maaaring maglakad patungo sa pasamanong ito nang walang nakakakita. Ang isang bakurang ganoon kaabala, tulad ng sinabi mismo ni Pete, ay puno ng mga bakas at walang mga sagot. Ang niyebe sa paligid ng baitang ni Greta ay binayo at naging malabnaw na putik at muling nagyelo, sapatos sa ibabaw ng sapatos, ng tsuper ng paghahatid, sa kanya, ng araro, at Diyos lamang ang nakakaalam kung kanino. Isang daang yapak. Walang ni isa roon ang may pangalan.</w:t>
+        <w:t xml:space="preserve">At maaabot ito. Iyon ang problema rito. Hindi ito kaha-de-yero. Isang pintuang kahoy sa pampublikong eskinita na nakabukas sa kalahati ng bawat umaga hanggang sa insidente ng ladrilyo. Sinumang nakakaalam sa mga oras ng isang panadero at may dahilan upang mapunta sa bakurang iyon bago mag-umaga ay maaaring maglakad patungo sa pasamanong ito nang walang nakakakita. Ang isang bakurang ganoon kaabala, tulad ng sinabi mismo ni Pete, ay puno ng mga bakas at walang mga sagot. Ang niyebe sa paligid ng baitang ni Greta ay binayo at naging malabnaw na putik at muling nagyelo, sapatos sa ibabaw ng sapatos, ng tsuper ng paghahatid, sa kanya, ng araro, at Diyos lamang ang nakakaalam kung kanino. Isang daang yapak. Walang ni isa roon ang may pangalan.</w:t>
       </w:r>
     </w:p>
     <w:p/>
@@ -3431,7 +3431,7 @@
     <w:p/>
     <w:p>
       <w:r>
-        <w:t xml:space="preserve">Sa usapin ng daanan, masama ang naging itsura niya kaysa dati, dahil ang pagkakalapit ang tanging bagay na kinulang sa buong usaping ito, at narito na nga, at nakapangalan pa sa kaniya.</w:t>
+        <w:t xml:space="preserve">Sa usapin ng daanan, mas masama ang naging itsura niya kaysa kailanman, dahil ang pagkakalapit ang tanging bagay na kinulang sa buong usaping ito, at narito na nga, at nakapangalan pa sa kaniya.</w:t>
       </w:r>
     </w:p>
     <w:p/>
@@ -3473,7 +3473,7 @@
     <w:p/>
     <w:p>
       <w:r>
-        <w:t xml:space="preserve">“Ayaw ko rin sa tinuturo ng mapa,” sabi ko. Huli akong tumingin sa malamig na bunganga ng dakong-kargahan, sa mababang pinto ni Greta na bukas ang kalahati sa bawat madilim na umaga hanggang sa insidente ng ladrilyo, at tatlong pinto ang layo sa tarangkahan ng magkakatay kung saan ang isang mabuting tao ay may sapat na dahilan para naroon bago sumapit ang liwanag. “Mas gusto ko siya noong nakaraang linggo. Noon ay tanikala lamang at kaunting sigawan ang lahat. Mas mahirap lampasan ang pagkakalapit kapag pinawawalang-sala mo ang isang tao.”</w:t>
+        <w:t xml:space="preserve">“Ayaw ko rin sa tinuturo ng mapa,” sabi ko. Huli akong tumingin sa malamig na bunganga ng dakong-kargahan, sa mababang pinto ni Greta na bukas sa kalahati ng bawat madilim na umaga hanggang sa insidente ng ladrilyo, at tatlong pinto ang layo sa tarangkahan ng magkakatay kung saan ang isang mabuting tao ay may sapat na dahilan para naroon bago sumapit ang liwanag. “Mas gusto ko siya noong nakaraang linggo. Noon ay tanikala lamang at kaunting sigawan ang lahat. Mas mahirap lampasan ang pagkakalapit kapag pinawawalang-sala mo ang isang tao.”</w:t>
       </w:r>
     </w:p>
     <w:p/>
@@ -3562,7 +3562,7 @@
     <w:p/>
     <w:p>
       <w:r>
-        <w:t xml:space="preserve">Inalis ko ang takure sa kalan. Iginuhit ko ang malamig na linyang iyon patungo sa kaniyang tarangkahan dahil lamang sa pagkakalapit, at ang pagkakalapit, sinabi ko sa aking sarili sa eskinita, ay isang pintuan at hindi isang hatol. Tumayo siyang diretso sa pintuan, oo. Ngunit ang silid sa kabila nito ay may taglay na init ng ulo na wala siya at isang kalakal na hindi niya alam.</w:t>
+        <w:t xml:space="preserve">Inalis ko ang takure sa kalan. Iginuhit ko ang malamig na linyang iyon patungo sa kaniyang tarangkahan dahil lamang sa pagkakalapit, at ang pagkakalapit, sinabi ko sa aking sarili sa eskinita, ay isang pintuan at hindi isang hatol. Tumayo siyang diretso sa pintuan, oo. Ngunit ang silid sa kabila nito ay nangangailangan ng ugaling wala sa kaniya at ng hanapbuhay na hindi niya alam.</w:t>
       </w:r>
     </w:p>
     <w:p/>
@@ -3586,19 +3586,19 @@
     <w:p/>
     <w:p>
       <w:r>
-        <w:t>Natagpuan ko siya sa kaniyang bloke nang hindi pa bukas ang tindahan, hinahati ang tagiliran ng umaga, at dumiretso siya nang tumunog ang kampana at inilatag nang patag ang kaniyang kutsilyo, handa, tulad ng paghahanda niya noong unang pagkakataon, isang lalaking lumaki na umaasa sa isang bagay sa kaniyang pintuan.</w:t>
-      </w:r>
-    </w:p>
-    <w:p/>
-    <w:p>
-      <w:r>
-        <w:t xml:space="preserve">“Hindi ko kayo aabalahin sa inyong trabaho,” sabi ko. “Narito ako para sabihin sa inyo na isinama ko kayo sa mga pinaghihinalaan. Ang gulo ni Greta. Sa malinaw na katotohanan na kayo ay nasa bakurang iyon bago mag-umaga at walang ibang may karapatang tumayo roon.” Napag-alaman ko na pinakamainam na iabot sa isang tao ang pangit na bagay nang buo at hayaan siyang tingnan ito. “At narito ako para sabihin sa inyo na inalis ko na kayo. Kung ano man ang gumawa nito ay gustong magkaroon ng init ng ulo para sa kadiliman at kalakal ng panadero para sa pulbos, at wala kayo sa dalawa. Nagtatalo kayo sa tanghali, at naghihiwa kayo ng karne. Hindi ito nababagay sa inyo.”</w:t>
-      </w:r>
-    </w:p>
-    <w:p/>
-    <w:p>
-      <w:r>
-        <w:t xml:space="preserve">Tinitigan niya ako nang sandali sa ibabaw ng bloke, kakaibang tahimik para sa isang lalaking isinuot ang kaniyang hinaing nang napakalakas nitong mga nakaraang linggo, at nang magsalita siya ay magaspang ito. “Hindi kayo naparito para lang mambola ng isang matandang masungit.”</w:t>
+        <w:t>Natagpuan ko siya sa kaniyang bloke nang hindi pa bukas ang tindahan, hinahati ang tagiliran ng umaga, at dumiretso siya nang tumunog ang kampana at inilatag nang patag ang kaniyang kutsilyo, handa, tulad ng paghahanda niya noong unang pagkakataon, isang lalaking nasanay nang umasa ng iisang bagay mula sa mga pumapasok sa kaniyang pinto.</w:t>
+      </w:r>
+    </w:p>
+    <w:p/>
+    <w:p>
+      <w:r>
+        <w:t xml:space="preserve">“Hindi ko kayo aabalahin sa inyong trabaho,” sabi ko. “Narito ako para sabihin sa inyo na isinama ko kayo sa mga pinaghihinalaan. Ang gulo ni Greta. Sa malinaw na katotohanan na kayo ay nasa bakurang iyon bago mag-umaga at walang ibang may karapatang tumayo roon.” Napag-alaman ko na pinakamainam na iabot sa isang tao ang pangit na bagay nang buo at hayaan siyang tingnan ito. “At narito ako para sabihin sa inyo na inalis ko na kayo. Kung ano man ang gumawa nito ay nangailangan ng ugaling sanay sa dilim at ng hanapbuhay ng panadero para sa pulbos, at wala kayo sa dalawa. Nagtatalo kayo sa tanghali, at naghihiwa kayo ng karne. Hindi ito nababagay sa inyo.”</w:t>
+      </w:r>
+    </w:p>
+    <w:p/>
+    <w:p>
+      <w:r>
+        <w:t xml:space="preserve">Tinitigan niya ako nang matagal sa ibabaw ng bloke, kakaibang tahimik para sa isang lalaking isinuot ang kaniyang hinaing nang napakalakas nitong mga nakaraang linggo, at nang magsalita siya ay magaspang ito. “Hindi kayo naparito para lang mambola ng isang matandang masungit.”</w:t>
       </w:r>
     </w:p>
     <w:p/>
@@ -4145,7 +4145,7 @@
     </w:p>
     <w:p>
       <w:r>
-        <w:t xml:space="preserve">Hindi iyon bago sa sinuman. Ang kahon na may linyang sedro ng Society ay nakabukas na nakatagilid sa mesa nito mula pa noong Oktubre na may ilang maagang alay sa ilalim: guhit ng bata ng tore ng orasan, isang pinatuyong dahon ng maple, ang kard ng resipe ng tsokolate-pecan ni Greta, ang dalawang guwantes na kasinglaki ng hinlalaki ni Bram. Nang umagang iyon ay dinala iyon ni Theo pababa sa Grange at inilagay sa isang mesa sa ilalim ng isang sulat-kamay na kard: </w:t>
+        <w:t xml:space="preserve">Hindi iyon bago sa sinuman. Ang kahon na may linyang sedro ng Society ay nakabukas na nakatagilid sa mesa nito mula pa noong Oktubre na may ilang maagang alay sa ilalim: guhit ng bata ng tore ng orasan, isang pinatuyong dahon ng maple, ang kard ng resipe ng tsokolate-pecan ni Greta, ang dalawang guwantes ni Bram na kasinglaki ng hinlalaki. Nang umagang iyon ay dinala iyon ni Theo pababa sa Grange at inilagay sa isang mesa sa ilalim ng isang sulat-kamay na kard: </w:t>
       </w:r>
       <w:r>
         <w:rPr>
@@ -4635,7 +4635,7 @@
     <w:p/>
     <w:p>
       <w:r>
-        <w:t xml:space="preserve">“May isang umaga na nakita ko ang isang tao sa likod ng kay Greta. Madilim na madilim pa, bago umandar ang kanyang mga oven, wala pang ilaw sa kanyang bintana noon. Isang may-gulang, na nakasuot ng apron ng panadero. Hindi si Greta. Malaki ang katawan ni Greta, at ang taong ito ay payat. Mabilis at malinis, hindi tulad ng isang taong nagsisimula ng trabaho. Isang mahabang apron, iyong umaabot hanggang sa kanyang mga binti, maputla, na may amerikana sa ilalim. Tumigil ito sandali sa kanyang baitang sa likod, at pagkatapos ay umakyat ito sa eskinita patungo sa kabilang dulo. Wala itong pinasukan kahit saan. Nawala ito sa akin nang lampasan ko ang ilaw sa parmasya.” Sumimangot siya. “Akala ko paghahatid iyon.”</w:t>
+        <w:t xml:space="preserve">“May isang umaga na nakita ko ang isang tao sa likod ng kay Greta. Madilim na madilim pa, bago umandar ang kanyang mga oven, wala pang ilaw sa kanyang bintana noon. Isang may-gulang, na nakasuot ng apron ng panadero. Hindi si Greta. Malaki ang katawan ni Greta, at ang taong ito ay payat. Mabilis at malinis, hindi tulad ng isang taong nagsisimula ng trabaho. Isang mahabang apron, iyong umaabot hanggang sa kanyang mga binti, maputla, na may amerikana sa ilalim. Tumigil ito sandali sa kanyang baitang sa likod, at pagkatapos ay umakyat ito sa eskinita patungo sa kabilang dulo. Wala itong pinasukan kahit saan. Nawala ito sa paningin ko nang lumampas ito sa ilaw sa parmasya.” Sumimangot siya. “Akala ko paghahatid iyon.”</w:t>
       </w:r>
     </w:p>
     <w:p/>
@@ -4707,7 +4707,7 @@
     <w:p/>
     <w:p>
       <w:r>
-        <w:t xml:space="preserve">“Sakali man.” Ibinaba niya ang lente. “Akala ninyo siya ang gumawa nito.”</w:t>
+        <w:t xml:space="preserve">“Sakali man.” Ibinaba niya ang lente. “Sa tingin ninyo siya ang gumawa nito.”</w:t>
       </w:r>
     </w:p>
     <w:p/>
@@ -4809,7 +4809,7 @@
     <w:p/>
     <w:p>
       <w:r>
-        <w:t xml:space="preserve">“May naglagay ng maasim na base sa harina ni Greta,” wika ko. “Asido sa kusina ng tinapay, sapat upang maasim ang lahat ng kanyang inihurno. Ngayong umaga ay binanggit ninyo sa akin ang semento at ang panangga sa panahon at ang lababo, ang tatlong depekto na pinangalanan sa reklamo bago pa man pumasok ang tagasiyasat. Kaya naparito ako upang magtanong nang direkta sa inyo. Kayo ba iyon?”</w:t>
+        <w:t xml:space="preserve">“May naglagay ng maasim na base sa harina ni Greta,” wika ko. “Asido sa kusina ng tinapay, sapat upang mapaasim ang lahat ng kanyang inihurno. Ngayong umaga ay binanggit ninyo sa akin ang semento at ang panangga sa panahon at ang lababo, ang tatlong depekto na pinangalanan sa reklamo bago pa man pumasok ang tagasiyasat. Kaya naparito ako upang magtanong nang direkta sa inyo. Kayo ba iyon?”</w:t>
       </w:r>
     </w:p>
     <w:p/>
@@ -5423,7 +5423,7 @@
     <w:p/>
     <w:p>
       <w:r>
-        <w:t xml:space="preserve">“Iyon ang pinaniniwalaan ko. Pagkatapos ay pinuntahan ni Doc ang kaniyang bodega noong Huwebes at walang maasim na base doon, at sinabi niya sa akin kung sino ang nagsasabi sa kaniya tungkol sa semento ni Greta.” Hindi na ako nagpatuloy doon, dahil nanumpa ako laban sa mga mukha para sa gabing ito. “Kaya naiwan ako sa papel. Ang polyeto ay isang proof sa counter ng isang tao bago pa man ito maging polyeto sa isang pisara. May nakakita roon. May nakabasa ng linggong iyon mula rito, at sumulat ng reklamo sa kondado para tumapat dito.”</w:t>
+        <w:t xml:space="preserve">“Iyon ang pinaniniwalaan ko. Pagkatapos ay pinuntahan ni Doc ang kaniyang bodega noong Huwebes at walang maasim na base doon, at sinabi niya sa akin kung sino ang nagsasabi sa kaniya tungkol sa semento ni Greta.” Hindi na ako nagpatuloy doon, dahil nanumpa ako laban sa mga mukha para sa gabing ito. “Kaya naiwan ako sa papel. Ang polyeto ay borador muna ng imprenta sa counter ng isang tao bago pa man ito maging polyeto sa isang pisara. May nakakita roon. May nakabasa ng linggong iyon mula rito, at sumulat ng reklamo sa kondado para tumapat dito.”</w:t>
       </w:r>
     </w:p>
     <w:p/>
@@ -5865,7 +5865,7 @@
     <w:p/>
     <w:p>
       <w:r>
-        <w:t xml:space="preserve">“Sa Pelkey's, sa Lewiston. Lahat ng pakyawang panaderya sa gilid ng mga bundok na ito ay doon kumukuha.” Huminga siya nang malalim. “Si Joyce mismo ang nagbukas ng aming account doon noong unang taon, at dinala niya ito nang umalis siya, at hindi niya iyon pinalitan. Mas gugustuhin pa ni Joyce ang makipag-away sa tagapagtustos kaysa lumipat.” Isa pang buntong-hininga. “Huwag kang dadaan dito ngayon. At huwag mo rin akong kausaping may pagpapakaawa sa telepono. Hindi ko kaya.”</w:t>
+        <w:t xml:space="preserve">“Sa Pelkey's, sa Lewiston. Lahat ng pakyawang panaderya sa gilid ng mga bundok na ito ay doon kumukuha.” Huminga siya nang malalim. “Si Joyce mismo ang nagbukas ng aming account doon noong unang taon, at dinala niya ito nang umalis siya, at hindi niya iyon pinalitan. Mas gugustuhin pa ni Joyce ang makipag-away sa tagapagtustos kaysa lumipat.” Isa pang buntong-hininga. “Huwag kang dadaan dito ngayon. At huwag mo rin akong kaawaan sa telepono. Hindi ko kaya.”</w:t>
       </w:r>
     </w:p>
     <w:p/>
@@ -5895,7 +5895,7 @@
     <w:p/>
     <w:p>
       <w:r>
-        <w:t xml:space="preserve">“Hahawakan kita sa dalawang pangakong iyan.” Hinila niya palapit ang laptop. “Sige. Lahat ng kompanya ay kailangang magparehistro sa estado, at kahit sino ay pwedeng maghanap tungkol sa kanila. Kalahati ng trabaho ko ay ang screen na ito. Ano ang pangalan?”</w:t>
+        <w:t xml:space="preserve">“Panghahawakan ko ang dalawang pangakong iyan.” Hinila niya palapit ang laptop. “Sige. Lahat ng kompanya ay kailangang magparehistro sa estado, at kahit sino ay pwedeng maghanap tungkol sa kanila. Kalahati ng trabaho ko ay ang screen na ito. Ano ang pangalan?”</w:t>
       </w:r>
     </w:p>
     <w:p/>
@@ -6303,7 +6303,7 @@
     </w:p>
     <w:p>
       <w:r>
-        <w:t xml:space="preserve">“Nakita ni Danny Ott ang isang payat, mabilis na pigura sa pasamano ni Greta bago mag-umaga, na lumalayo patungo sa kabilang dulo. Isa pang umaga ay nakita niya ang isang kahon na may ginto sa tatak sa kanyang pintuan. Inilalagay ng pahina ni Claire si Joyce sa likod ng liham ng abogado na pinunit ni Greta noong Agosto.” Hinawakan ko ang nakatuping papel sa aking kandungan. “Ang polyeto ni Renée para sa kanyang linggo ng pagbubukas ay nakalatag bilang proof sa kanyang counter noong Oktubre, habang binibisita siya ni Joyce dala ang mga sampol, at lumapag ang reklamo sa mismong linggong iyon. Ang polyeto ay hindi idinikit sa pisara ng Grange hanggang noong tatlumpu. Ang sako ni Pelkey ay napunta sa Bridgton noong dalawampu't pito. At sinabi sa sulat ni Doc na ang pulbos sa aking garapon ay tugma sa maasim na base, pagsubok matapos ang pagsubok.”</w:t>
+        <w:t xml:space="preserve">“Nakita ni Danny Ott ang isang payat, mabilis na pigura sa pasamano ni Greta bago mag-umaga, na lumalayo patungo sa kabilang dulo. Isa pang umaga ay nakita niya ang isang kahon na may ginto sa tatak sa kanyang pintuan. Inilalagay ng pahina ni Claire si Joyce sa likod ng liham ng abogado na pinunit ni Greta noong Agosto.” Hinawakan ko ang nakatuping papel sa aking kandungan. “Ang polyeto ni Renée para sa kanyang linggo ng pagbubukas ay nakalatag bilang borador ng imprenta sa kanyang counter noong Oktubre, habang binibisita siya ni Joyce dala ang mga sampol, at lumapag ang reklamo sa mismong linggong iyon. Ang polyeto ay hindi idinikit sa pisara ng Grange hanggang noong tatlumpu. Ang sako ni Pelkey ay napunta sa Bridgton noong dalawampu't pito. At sinabi sa sulat ni Doc na ang pulbos sa aking garapon ay tugma sa maasim na base, pagsubok matapos ang pagsubok.”</w:t>
       </w:r>
     </w:p>
     <w:p>
@@ -6413,7 +6413,7 @@
     </w:p>
     <w:p>
       <w:r>
-        <w:t>Tinawagan siya sa telepono ni Tanaka, at umakyat si Greta sa mga baitang ng istasyon hindi nagtagal pagkatapos suot ang kanyang magandang amerikana, na hila-hila pababa ang sumbrero at nakatakda ang bibig para sa isa pang dagok.</w:t>
+        <w:t>Tinawagan siya ni Tanaka, at umakyat si Greta sa mga baitang ng istasyon hindi nagtagal pagkatapos suot ang kanyang magandang amerikana, na hila-hila pababa ang sumbrero at nakatakda ang bibig para sa isa pang dagok.</w:t>
       </w:r>
     </w:p>
     <w:p>
@@ -6443,7 +6443,7 @@
     </w:p>
     <w:p>
       <w:r>
-        <w:t>Walang sumagot doon. Sa kalan ay umabot sa pagsitsit ang takure. Humakbang si Pip palayo sa init at gumawa ng malalim, pormal na pagyuko sa nayupit na ibon sa tagiliran nito, at yumuko rin pabalik ang nayupit na ibon. Gumalaw at tumatag ang sulok ng labi ni Greta.</w:t>
+        <w:t>Walang sumagot doon. Sa kalan ay umabot sa pagsitsit ang takure. Humakbang si Pip palayo sa init at gumawa ng malalim, pormal na pagyuko sa nayuping ibon sa tagiliran nito, at yumuko rin pabalik ang nayuping ibon. Gumalaw at tumatag ang sulok ng labi ni Greta.</w:t>
       </w:r>
     </w:p>
     <w:p>
@@ -6577,7 +6577,7 @@
     <w:p/>
     <w:p>
       <w:r>
-        <w:t xml:space="preserve">“Ginang Wendt,” wika ni Tanaka, “hindi kayo arestado. Kusa kayong dumating at maaari kayong umalis kung kailan ninyo gusto. Hinihiling ko lamang na makinig muna kayo. Ilalatag ko sa harap ninyo ang hawak namin. Pagkatapos ko, kayo naman ang magsasalita. Lahat ay may ganitong pagkakataon.” Binuksan niya ang brown folder.</w:t>
+        <w:t xml:space="preserve">“Ginang Wendt,” wika ni Tanaka, “hindi kayo arestado. Kusa kayong dumating at maaari kayong umalis kung kailan ninyo gusto. Hinihiling ko lamang na makinig muna kayo. Ilalatag ko sa harap ninyo ang hawak namin. Pagkatapos ko, kayo naman ang magsasalita. Lahat ay may ganitong pagkakataon.” Binuksan niya ang kayumangging folder.</w:t>
       </w:r>
     </w:p>
     <w:p/>
@@ -6721,7 +6721,7 @@
     <w:p/>
     <w:p>
       <w:r>
-        <w:t xml:space="preserve">“Akin ang pie na iyon. Pinaghirapan ko iyon sa mesa na iyon, noong unang taglamig, kasama ang pecan pie ng aking ina at isang libra ng tsokolate na hindi namin kayang bilhin. Kalahati ko ang tindahan. Nilinis ko ang sahig na iyon nang nakaluhod bago pa man kami nagbukas ng pinto. Labinlimang taon, magkatabi. At inangkin niya ito. Ang pangalan sa itaas ng pinto. Ang pie.” Nanatiling kalmado ang kanyang boses sa buong oras. “Bawat Araw ng Pasasalamat sa loob ng dalawampu't limang taon, nakatayo ang mga tao sa pila sa labas ng pintong iyon para sa tsokolate-pecan ni Greta. May isang kard sa kahon na iyon sa Grange na nakasulat ang resipe. Inililibing nila ito. Binasa ko ito habang nagbababa ako ng tinapay para kay Hal. Kay Greta. Sa sulat-kamay mo.”</w:t>
+        <w:t xml:space="preserve">“Akin ang pie na iyon. Pinaghirapan ko iyon sa mesa na iyon, noong unang taglamig, kasama ang pecan pie ng aking ina at isang libra ng tsokolate na hindi namin kayang bilhin. Kalahati ng tindahan ay akin. Nilinis ko ang sahig na iyon nang nakaluhod bago pa man kami nagbukas ng pinto. Labinlimang taon, magkatabi. At inangkin niya ito. Ang pangalan sa itaas ng pinto. Ang pie.” Nanatiling kalmado ang kanyang boses sa buong oras. “Bawat Araw ng Pasasalamat sa loob ng dalawampu't limang taon, nakatayo ang mga tao sa pila sa labas ng pintong iyon para sa tsokolate-pecan ni Greta. May isang kard sa kahon na iyon sa Grange na nakasulat ang resipe. Inililibing nila ito. Binasa ko ito habang nagbababa ako ng tinapay para kay Hal. Kay Greta. Sa sulat-kamay mo.”</w:t>
       </w:r>
     </w:p>
     <w:p/>
@@ -6847,7 +6847,7 @@
     <w:p/>
     <w:p>
       <w:r>
-        <w:t xml:space="preserve">“Kakailanganin ninyo ng abogado ngayon, Ginang Wendt,” aniya, nang hindi masama ang tono. “Karapatan ninyo iyon, at kukunin ko iyon, kung ako ang nasa posisyon ninyo. Ngunit magiging malinaw ako tungkol dito, para walang malito mamaya. Ang hawak ko ay talaan ng tagapagtustos na may pirma ninyo, pagtutugma ng isang kimiko, rehistro ng estado, isang lalaking nakakaalam ng inyong van, at dalawang babaeng tinawagan ng inyong panaderya na may mga order mula sa aklat na wala kayong karapatang basahin. Lahat ng ito ay nakasulat. Wala rito ang nangangailangan na umamin kayo sa anupaman.” Ibinaba niya ang panulat. “Anuman ang pinagsisisihan ninyo ngayong hapon, at sa palagay ko ay mayroon, hindi nito binabago ang kahit isang salita sa pahina. Sasampahan kayo ngayon. Tawagan ang inyong abogado, bumalik kayo rito kasama siya pagsapit ng alas-sais, at gagawin namin ang natitira nang tahimik.”</w:t>
+        <w:t xml:space="preserve">“Kakailanganin ninyo ng abogado ngayon, Ginang Wendt,” aniya, nang hindi masama ang tono. “Karapatan ninyo iyon, at kukunin ko iyon, kung ako ang nasa posisyon ninyo. Ngunit magiging malinaw ako tungkol dito, para walang malito mamaya. Ang hawak ko ay talaan ng tagapagtustos na may pirma ninyo, pagtutugma ng isang kimiko, rehistro ng estado, isang lalaking nakakaalam ng inyong van, at dalawang babaeng tinawagan ng inyong panaderya na may mga order mula sa aklat na wala kayong karapatang basahin. Lahat ng ito ay nakasulat. Wala rito ang nangangailangan na umamin kayo sa anupaman.” Ibinaba niya ang panulat. “Anuman ang pinagsisisihan ninyo ngayong hapon, at sa palagay ko ay mayroon, hindi nito binabago ang kahit isang salita sa pahina. Sasampahan kayo ng kaso ngayong araw. Tawagan ang inyong abogado, bumalik kayo rito kasama siya pagsapit ng alas-sais, at gagawin namin ang natitira nang tahimik.”</w:t>
       </w:r>
     </w:p>
     <w:p/>

</xml_diff>

<commit_message>
Full proofcheck Flour Play Filipino: SIGNIFICANT (93 fixes)
Co-Authored-By: Claude Opus 5.5 <noreply@anthropic.com>
Claude-Session: https://claude.ai/code/session_012Cm8JxdqzjuttdUSdkQCUg
</commit_message>
<xml_diff>
--- a/translated/corrected/Flour Play - ASSEMBLED - FORMATTED_Filipino.docx
+++ b/translated/corrected/Flour Play - ASSEMBLED - FORMATTED_Filipino.docx
@@ -132,7 +132,7 @@
     <w:p/>
     <w:p>
       <w:r>
-        <w:t xml:space="preserve">Madaling magturo ang bayan ng mga karaniwang salarin: ang magkakatay na naglagay ng kadena sa tarangkahan, ang pamilyang may atraso sa langis, ang batang nababagot na may dalang ninakaw na lata. Inaabot ni Jessica ang bagay na tumutugma — dahil ang gumawa nito ay bumili ng pulbos, alam ang tamang dami, at naghain ng reklamong tumukoy pati sa sub-seksyon ng kodigo sa kalusugan. Hindi iyon basta init ng ulo. Iyon ay isang hanapbuhay. Trabaho iyon.</w:t>
+        <w:t xml:space="preserve">Madaling magturo ang bayan ng mga karaniwang salarin: ang magkakatay na naglagay ng kadena sa tarangkahan, ang pamilyang may atraso sa langis, ang batang nababagot na may dalang ninakaw na lata. Inaabot ni Jessica ang bagay na tumutugma — dahil ang gumawa nito ay bumili ng pulbos, alam ang tamang dami, at naghain ng reklamong tumukoy pati sa sub-seksyon ng kodigo sa kalusugan. Hindi iyon basta init ng ulo. Iyon ay isang hanapbuhay.</w:t>
       </w:r>
     </w:p>
     <w:p/>
@@ -239,7 +239,7 @@
     <w:p/>
     <w:p>
       <w:r>
-        <w:t xml:space="preserve">Napagtanto ko noon, habang inilalapat ang maliliit na usbong sa ibabaw ng isa't isa, kung gaano kalayo ang aking nilakbay upang maupo roon. Hindi ang mga milya. Marami sa mga iyon, ngunit hindi ang mga milya ang tinutukoy ko. Hindi pa nagtatagal, ako ang bagong salta sa Frost Falls. Ang babae mula sa Hilagang Polo na may tanyag na asawa at ang kakaibang penguin. Naging mabait ang mga tao sa akin kung paanong ang isang bayan ay mabait sa isang panauhin, na ibig sabihin ay naglaan sila ng puwang at nagmanman upang makita kung ano ang gagawin ko rito. At ngayon ay sinusubukan ni Olivia na magnakaw ng aking paraan ng pagtali ng korona. Natulog ang aso ni Martha laban sa aking silya nang kasing-dali ng pag-upo nito sa kaniya. Wala nang nagpapaliwanag sa akin ng anuman. Ipinagpalagay nilang alam ko. Mabilis kong nakamit iyon sa isang mahirap na taglagas, sa isang nawalang aso at isang kapsula ng oras.</w:t>
+        <w:t xml:space="preserve">Napagtanto ko noon, habang inilalapat ang maliliit na usbong sa ibabaw ng isa't isa, kung gaano kalayo ang aking nilakbay upang maupo roon. Hindi ang mga milya. Marami sa mga iyon, ngunit hindi ang mga milya ang tinutukoy ko. Hindi pa nagtatagal, ako ang bagong salta sa Frost Falls. Ang babae mula sa Hilagang Polo na may tanyag na asawa at ang kakaibang penguin. Naging mabait ang mga tao sa akin kung paanong ang isang bayan ay mabait sa isang panauhin, na ibig sabihin ay naglaan sila ng puwang at nagmanman upang makita kung ano ang gagawin ko rito. At ngayon ay sinusubukan ni Olivia na magnakaw ng aking paraan ng pagtali ng korona. Natulog ang aso ni Martha laban sa aking silya nang kasing-dali ng pagtulog nito sa kaniya. Wala nang nagpapaliwanag sa akin ng anuman. Ipinagpalagay nilang alam ko. Mabilis kong nakamit iyon sa isang mahirap na taglagas, sa isang nawalang aso at isang kapsula ng oras.</w:t>
       </w:r>
     </w:p>
     <w:p/>
@@ -389,7 +389,7 @@
     <w:p/>
     <w:p>
       <w:r>
-        <w:t xml:space="preserve">“Ideya ng isang tao ng biro,” pahayag ni Dot. “Pinihit ito sa magdamag. Mga bata.”</w:t>
+        <w:t xml:space="preserve">“Biro lang ng kung sino,” pahayag ni Dot. “Pinihit ito sa magdamag. Mga bata.”</w:t>
       </w:r>
     </w:p>
     <w:p/>
@@ -419,7 +419,7 @@
     <w:p/>
     <w:p>
       <w:r>
-        <w:t xml:space="preserve">Dahil alam ko ang pagkakaiba. Nabuhay na ako nang mahabang panahon ngayon kasabay ng mahika ng Pasko. Sapat na ang tagal upang malaman ito sa aking mga buto, payak gaya ng yapak sa aking hagdan. Hindi ito isang bata na may mga malamig na daliri. Malaya ang mahika sa Frost Falls. Malaya ito mula nang dumating kami, naghahanap ng tahanan. Ang aking asawa ay nagtatayo ng isa. Mabagal at matiyaga sa kaniyang pagawaan, isang apuyan para tirhan nito, at lumalapit ito nang kaunti sa apoy araw-araw. Ngunit hindi pa ito tuluyang naninirahan. Nandoon pa rin ito sa bayan sa gabi, padalos-dalos at ganap na walang masamang layunin, ginagawa ang maliliit at imposibleng mga bagay na ginagawa ng mahika kapag ito ay mas may damdamin kaysa katinuan. Pag-iiba ng mga ilaw ng pista mula kahel patungong ginto. At ngayon, lumilitaw, pinapalakad ang taong-niyebe ng isang bata sa dilim upang harapin kung ano man ang nakakuha ng lumalakad nitong atensyon.</w:t>
+        <w:t xml:space="preserve">Dahil alam ko ang pagkakaiba. Nabuhay na ako nang mahabang panahon ngayon kasabay ng mahika ng Pasko. Sapat na ang tagal upang malaman ito sa aking mga buto, payak gaya ng yapak sa aking hagdan. Hindi ito isang bata na may mga malamig na daliri. Malaya ang mahika sa Frost Falls. Malaya ito mula nang dumating kami, naghahanap ng tahanan. Ang aking asawa ay nagtatayo ng isa. Mabagal at matiyaga sa kaniyang pagawaan, isang apuyan para tirhan nito, at lumalapit ito nang kaunti sa apoy araw-araw. Ngunit hindi pa ito tuluyang naninirahan. Nandoon pa rin ito sa bayan sa gabi, padalos-dalos at ganap na walang masamang layunin, ginagawa ang maliliit at imposibleng mga bagay na ginagawa ng mahika kapag ito ay mas may damdamin kaysa katinuan. Pag-iiba ng mga ilaw ng pista mula kahel patungong ginto. At ngayon, lumilitaw, pinapalakad ang taong-niyebe ng isang bata sa dilim upang harapin kung ano man ang nakakuha ng pagala-gala nitong atensyon.</w:t>
       </w:r>
     </w:p>
     <w:p/>
@@ -550,19 +550,19 @@
     <w:p/>
     <w:p>
       <w:r>
-        <w:t xml:space="preserve">“Kahapon ng tanghali. Lumabas ang unang masamang tray at naisip ko, aba, Greta, naging pabaya ka, ang lahat ay pabaya minsan. Itinapon ko ito at nagsimulang muli, at nangyari itong muli. Hinahabol ko ang aking buntot simula noon, na ang mga order sa Araw ng Pasasalamat ay nakaupo sa aklat na iyon.”</w:t>
-      </w:r>
-    </w:p>
-    <w:p/>
-    <w:p>
-      <w:r>
-        <w:t>Isang ledger ang nakabukas sa counter, ang mga hanay ng mga pie at tinapay nito ay ipinangako ng kalahati ng Frost Falls.</w:t>
-      </w:r>
-    </w:p>
-    <w:p/>
-    <w:p>
-      <w:r>
-        <w:t xml:space="preserve">“At Pasko sa likod niyan,” sabi ni Greta. “Ang susunod na anim na linggo ay ang aking buong taon, Jessica. Ito ang pera na nagdadala sa akin hanggang tagsibol.” Inilatag niya ang kanyang kamay nang patag sa buong aklat. “Iyon ang dahilan kung bakit pinunit ko ang liham ng abogadong iyon noong Agosto. Isang kompanyang gustong bilhin ang lahat sa akin, buong-buo pati ang pangalan. Hindi ko pa nga narinig ang tungkol sa kanila.”</w:t>
+        <w:t xml:space="preserve">“Kahapon ng tanghali. Lumabas ang unang masamang tray at naisip ko, aba, Greta, naging pabaya ka, ang lahat ay pabaya minsan. Itinapon ko ito at nagsimulang muli, at nangyari itong muli. Paikot-ikot na lang ako simula noon, na ang mga order sa Araw ng Pasasalamat ay nakaupo sa aklat na iyon.”</w:t>
+      </w:r>
+    </w:p>
+    <w:p/>
+    <w:p>
+      <w:r>
+        <w:t>Isang ledger ang nakabukas sa counter, ang mga hanay ng mga pie at tinapay nito ay nakareserba na para sa kalahati ng Frost Falls.</w:t>
+      </w:r>
+    </w:p>
+    <w:p/>
+    <w:p>
+      <w:r>
+        <w:t xml:space="preserve">“At Pasko sa likod niyan,” sabi ni Greta. “Ang susunod na anim na linggo ay ang aking buong taon, Jessica. Ito ang pera na nagdadala sa akin hanggang tagsibol.” Inilatag niya ang kanyang kamay nang patag sa nakabukas na aklat. “Iyon ang dahilan kung bakit pinunit ko ang liham ng abogadong iyon noong Agosto. Isang kompanyang gustong bilhin ang lahat sa akin, buong-buo pati ang pangalan. Hindi ko pa nga narinig ang tungkol sa kanila.”</w:t>
       </w:r>
     </w:p>
     <w:p/>
@@ -681,7 +681,7 @@
     <w:p/>
     <w:p>
       <w:r>
-        <w:t xml:space="preserve">“Nakita mo na,” aniya. Hindi iyon tanong. “Lampas sa botika. Ginawa na nila ang karatula.”</w:t>
+        <w:t xml:space="preserve">“Nakita mo na,” aniya. Hindi iyon tanong. “Lampas sa parmasya. Ginawa na nila ang karatula.”</w:t>
       </w:r>
     </w:p>
     <w:p/>
@@ -831,7 +831,7 @@
     <w:p/>
     <w:p>
       <w:r>
-        <w:t xml:space="preserve">“Dalawang hurnong de-deck,” aniya, “gas, na may saksakan ng singaw. Hindi ka makakakuha ng tamang balat ng tinapay kung wala nito, anuman ang sabihin sa inyo ng mga panaderya sa nayon. Isang sheeter diyan, para sa mga masang may patong-patong na mantikilya. Isang blast chiller, na walang kusina sa lalawigan na ito ang mayroon, pusta ko ang aking apron.” Ipinahid niya ang kanyang kamay sa bakal. “Nag-aral ako sa Lyon. Pagkatapos ay labing-isang taon sa Montreal, dalawang taon doon ay nagpatakbo ng pastry house na nagpakain sa kalahati ng lungsod kung Pasko. Alam ko kung ano ang Disyembre, Jessica. Ang </w:t>
+        <w:t xml:space="preserve">“Dalawang hurnong de-deck,” aniya, “gas, na may saksakan ng singaw. Hindi ka makakakuha ng tamang balat ng tinapay kung wala nito, anuman ang sabihin sa inyo ng mga panaderya sa nayon. Isang sheeter diyan, para sa mga masang may patong-patong na mantikilya. Isang blast chiller, na walang kusina sa kondadong ito ang mayroon, pusta ko ang aking apron.” Pinadaan niya ang kanyang kamay sa bakal. “Nag-aral ako sa Lyon. Pagkatapos ay labing-isang taon sa Montreal, dalawang taon doon ay nagpatakbo ng pastry house na nagpakain sa kalahati ng lungsod kung Pasko. Alam ko kung ano ang Disyembre, Jessica. Ang </w:t>
       </w:r>
       <w:r>
         <w:t xml:space="preserve"/>
@@ -957,7 +957,7 @@
     <w:p/>
     <w:p>
       <w:r>
-        <w:t xml:space="preserve">Tuwid na tumindig si Hal mula sa mesa at iniikot ang kanyang papel para mabasa ko, dala ang mahiyang kasiyahan ng isang maingat na lalaki na nagpapakita ng isang bagay na pinag-isipang mabuti. Si Hal ang nagpapatakbo ng Frosty's Groceries sa malapit na dulo ng abenida, at siya ang pinakamaayos na kaluluwa sa </w:t>
+        <w:t xml:space="preserve">Tuwid na tumindig si Hal mula sa mesa at inikot ang kanyang papel para mabasa ko, dala ang mahiyang kasiyahan ng isang maingat na lalaki na nagpapakita ng isang bagay na pinag-isipang mabuti. Si Hal ang nagpapatakbo ng Frosty's Groceries sa malapit na dulo ng abenida, at siya ang pinakamaayos na kaluluwa sa </w:t>
       </w:r>
       <w:r>
         <w:t/>
@@ -975,7 +975,7 @@
     <w:p/>
     <w:p>
       <w:r>
-        <w:t xml:space="preserve">“Ideya lamang ito,” aniya. “Ngunit maagang dumating ang lamig ngayong taon, at sinasabi nilang magiging mahaba ang taglamig. Para sa ilang tao sa bayang ito, ang mahabang taglamig ay nangangahulugan ng higit pa sa magandang apoy at korona sa pinto.” Tinapik niya ang papel, kung saan gumuhit siya ng mga hanay gamit ang malinis na kamay: mga tuyong pagkain, de-lata, mga maiinit na gamit. “Isang kampanya para sa pagkain. Sa buong panahon. Walang engrande. Isang bariles sa unahan ng aking tindahan, isa rito kung papayag si Kelly, at isa sa simbahan. Maglalagay ang mga tao ng makakaya nila at pagdating ng Enero, kapag naging mahirap na, magkakaroon tayo ng nakatabi para sa sinumang mangangailangan nito.” Tumingin siya sa itaas, nahihiya muli, isang lalaki na natatakot na ang kanyang magandang ideya ay isiping mahina. “Minsan ay nakaranas ako ng masamang taglamig, bago ko pa nakuha ang tindahan. Naaalala ko pa kung sino ang nag-iwan ng kahon sa aking baitang. Gusto kong maging ganoon sa isang tao ngayong taon.”</w:t>
+        <w:t xml:space="preserve">“Ideya lamang ito,” aniya. “Ngunit maagang dumating ang lamig ngayong taon, at sinasabi nilang magiging mahaba ang taglamig. Para sa ilang tao sa bayang ito, ang mahabang taglamig ay nangangahulugan ng higit pa sa magandang apoy at korona sa pinto.” Tinapik niya ang papel, kung saan gumuhit siya ng mga hanay sa maayos na sulat-kamay: mga tuyong pagkain, de-lata, mga maiinit na gamit. “Isang kampanya para sa pagkain. Sa buong panahon. Walang engrande. Isang bariles sa unahan ng aking tindahan, isa rito kung papayag si Kelly, at isa sa simbahan. Maglalagay ang mga tao ng makakaya nila at pagdating ng Enero, kapag naging mahirap na, magkakaroon tayo ng nakatabi para sa sinumang mangangailangan nito.” Tumingin siya sa itaas, nahihiya muli, isang lalaki na natatakot na ang kanyang magandang ideya ay isiping mahina. “Minsan ay nakaranas ako ng masamang taglamig, bago ko pa nakuha ang tindahan. Naaalala ko pa kung sino ang nag-iwan ng kahon sa aking baitang. Gusto kong maging ganoon sa isang tao ngayong taon.”</w:t>
       </w:r>
     </w:p>
     <w:p/>
@@ -1111,7 +1111,7 @@
     <w:p/>
     <w:p>
       <w:r>
-        <w:t xml:space="preserve">“Hindi iyan ang iyong mga kamay.” Mas matalas kong sinabi iyon kaysa sa gusto ko, dahil hindi ko matagalan na marinig siyang sabihin iyon. “Hindi mo nakakalimutan ang apatnapung taon sa magdamag, at sa iyong kusina lamang. May iba pang mali rito, isang bagay na hindi ko pa makita, at sinasabi ko sa iyo na hindi ikaw iyon.”</w:t>
+        <w:t xml:space="preserve">“Hindi ang iyong mga kamay ang may problema.” Mas matalas kong sinabi iyon kaysa sa gusto ko, dahil hindi ko matagalan na marinig siyang sabihin iyon. “Hindi mo nakakalimutan ang apatnapung taon sa magdamag, at sa iyong kusina lamang. May iba pang mali rito, isang bagay na hindi ko pa makita, at sinasabi ko sa iyo na hindi ikaw iyon.”</w:t>
       </w:r>
     </w:p>
     <w:p/>
@@ -1183,7 +1183,7 @@
     <w:p/>
     <w:p>
       <w:r>
-        <w:t xml:space="preserve">Ang sirang bintana ay nagkakahalaga, at maaari itong ayusin. Magkakaroon muli ng salamin si Greta bago matapos ang linggo. Ngunit kung sino man ang pumasok sa gabi ay hindi tumigil sa salamin: isinulat nila, kung saan babasahin ng lahat ng dumadaan sa abenida, na marumi ang kaniyang pagkain at mapanganib ang kaniyang tindahan. At ang panaderya, gaya ng sinabi sa akin ni Renée dalawang araw na ang nakalipas sa labas ng kaniyang bagong tindahan, ay nabubuhay sa pangalan nito.</w:t>
+        <w:t xml:space="preserve">Ang sirang bintana ay nagkakahalaga, at maaari itong ayusin. Magkakaroon muli ng salamin si Greta bago matapos ang linggo. Ngunit kung sino man ang dumating sa gabi ay hindi tumigil sa salamin: isinulat nila, kung saan babasahin ng lahat ng dumadaan sa abenida, na marumi ang kaniyang pagkain at mapanganib ang kaniyang tindahan. At ang panaderya, gaya ng sinabi sa akin ni Renée dalawang araw na ang nakalipas sa labas ng kaniyang bagong tindahan, ay nabubuhay sa pangalan nito.</w:t>
       </w:r>
     </w:p>
     <w:p/>
@@ -1195,7 +1195,7 @@
     <w:p/>
     <w:p>
       <w:r>
-        <w:t xml:space="preserve">Nakatayo si Greta sa kaniyang pintuan suot ang kaniyang amerikana habang nasa likuran ang malamig at madilim na tindahan. Hindi siya umiiyak. Nakatayo siyang tuwid at tahimik at tiningnan ang salitang MARUMI sa kahoy na kaniyang kinukuskos bawat tagsibol. Ang kaniyang mukha ay may mukha ng pagkabigo ng isang mapagmataas na babae na pinatayong mag-isa sa publiko sa tabi ng kasinungalingan tungkol sa kaniyang sarili.</w:t>
+        <w:t xml:space="preserve">Nakatayo si Greta sa kaniyang pintuan suot ang kaniyang amerikana habang nasa likuran ang malamig at madilim na tindahan. Hindi siya umiiyak. Nakatayo siyang tuwid at tahimik at tiningnan ang salitang MARUMI sa kahoy na kaniyang kinukuskos bawat tagsibol. Ang kaniyang mukha ay may hubad at walang-pananggalang na anyo ng isang mapagmataas na babaeng pinatayo sa harap ng publiko sa tabi ng kasinungalingan tungkol sa kaniyang sarili.</w:t>
       </w:r>
     </w:p>
     <w:p/>
@@ -1249,7 +1249,7 @@
     <w:p/>
     <w:p>
       <w:r>
-        <w:t xml:space="preserve">“Kukunin ko siya,” wika ni Ivy. Dumating siya kasama ang karamihan sa bilog ng pagniniting sa likuran, sina Olivia at Ellie at Dot, lahat ay nasa bloke sa loob ng ilang minuto. Umalis siya sa maayos na hakbang.</w:t>
+        <w:t xml:space="preserve">“Kukunin ko siya,” wika ni Ivy. Dumating siya kasama ang karamihan sa bilog ng pagniniting sa likuran, sina Olivia at Ellie at Dot, lahat ay nasa bloke sa loob ng ilang minuto. Umalis siya nang mabilis ang hakbang.</w:t>
       </w:r>
     </w:p>
     <w:p/>
@@ -1279,7 +1279,7 @@
     <w:p/>
     <w:p>
       <w:r>
-        <w:t>Ngunit ang salita ay nasa dingding pa rin, at mananatili ito roon hanggang sa dumating si Tom. Kalahati ng bayan ang maglalakad lampas dito bago ito mawala, at maririnig ito ng kalahati sa hapunan. May nag-siguro na pag-uusapan ito ng bayan.</w:t>
+        <w:t>Ngunit ang salita ay nasa dingding pa rin, at mananatili ito roon hanggang sa dumating si Tom. Kalahati ng bayan ang maglalakad lampas dito bago ito mawala, at maririnig naman ito ng natitirang kalahati pagsapit ng hapunan. May nag-siguro na pag-uusapan ito ng bayan.</w:t>
       </w:r>
     </w:p>
     <w:p/>
@@ -1291,13 +1291,13 @@
     <w:p/>
     <w:p>
       <w:r>
-        <w:t xml:space="preserve">“May itsura ang iyong mukha,” aniya. “Mayroon ka rin niyan kahapon sa tindahan. May alam ka.”</w:t>
-      </w:r>
-    </w:p>
-    <w:p/>
-    <w:p>
-      <w:r>
-        <w:t xml:space="preserve">“Wala pa akong alam,” wika ko, na totoo, at mahirap sabihin. “Ngunit narito ang gagawin ko, at maaari mo akong panghawakan. Aalamin ko. Hindi kung sino ang gusto ko, at hindi kung ano ang madali, kundi ang katotohanan nito, mula itaas hanggang ibaba. May gumawa nito sa iyo nang sinasadya.” Hinawakan ko ang kaniyang malamig na kamay sa pareho kong mga kamay. “Panatilihin mong nakataas ang iyong baba at hayaang tulungan ka ng mga tao, at iwanan ang iba sa akin. May gustong huminto ang Frost Falls sa pagtitiwala sa Holly Jolly. Aalamin ko kung bakit, at pagkatapos ay kung sino, at pagkatapos ay gagawin natin silang magsisi nang husto na pinili nila ang kanilang laban sa aking abenida.”</w:t>
+        <w:t xml:space="preserve">“Iba ang itsura ng mukha mo,” aniya. “Ganyan ka rin kahapon sa tindahan. May alam ka.”</w:t>
+      </w:r>
+    </w:p>
+    <w:p/>
+    <w:p>
+      <w:r>
+        <w:t xml:space="preserve">“Wala pa akong alam,” wika ko, na totoo, at mahirap sabihin. “Ngunit narito ang gagawin ko, at maaari mo akong panghawakan. Aalamin ko. Hindi kung sino ang gusto ko, at hindi kung ano ang madali, kundi ang katotohanan nito, mula itaas hanggang ibaba. May gumawa nito sa iyo nang sinasadya.” Hinawakan ko ang kaniyang malamig na kamay sa pareho kong mga kamay. “Panatilihin mong nakataas ang iyong baba at hayaang tulungan ka ng mga tao, at iwanan ang iba sa akin. May taong gustong tumigil na ang Frost Falls sa pagtitiwala sa Holly Jolly. Aalamin ko kung bakit, at pagkatapos ay kung sino, at pagkatapos ay gagawin natin silang magsisi nang husto na pinili nila ang kanilang laban sa aking abenida.”</w:t>
       </w:r>
     </w:p>
     <w:p/>
@@ -1632,7 +1632,7 @@
     <w:p/>
     <w:p>
       <w:r>
-        <w:t xml:space="preserve">“Walang naku. Naisip ninyong lahat ito, o hindi sana kayo nakatingin sa inyong mga kandungan.” Pinagpilitan ni Dot ang isang sanga, malinaw at mabilis. “Magkaaway sina Pete at Greta tungkol sa likod na eskinitang iyon mula pa noong tag-init.”</w:t>
+        <w:t xml:space="preserve">“Walang naku. Naisip ninyong lahat ito, o hindi sana kayo nakatingin sa inyong mga kandungan.” Mahigpit na itinali ni Dot ang isang sanga, malinaw at mabilis. “Magkaaway sina Pete at Greta tungkol sa likod na eskinitang iyon mula pa noong tag-init.”</w:t>
       </w:r>
     </w:p>
     <w:p/>
@@ -1728,7 +1728,7 @@
     <w:p/>
     <w:p>
       <w:r>
-        <w:t xml:space="preserve">“Ipapaliwanag nito kung gaano ito kagaspang,” pahintulot ni Claire, habang sumusulat. “Tumulo ang mga titik. Ang sinumang gumawa nito ay walang pakialam na tumulo sila. Hindi iyon maingat na kamay.”</w:t>
+        <w:t xml:space="preserve">“Ipapaliwanag nito kung gaano ito kagaspang,” pag-amin ni Claire, habang sumusulat. “Tumulo ang mga titik. Ang sinumang gumawa nito ay walang pakialam na tumulo sila. Hindi iyon maingat na kamay.”</w:t>
       </w:r>
     </w:p>
     <w:p/>
@@ -1740,7 +1740,7 @@
     <w:p/>
     <w:p>
       <w:r>
-        <w:t xml:space="preserve">“Mga bata para sa pintura, marahil,” sabi ko. “Ang natira, hahawakan ko nang mas maluwag.”</w:t>
+        <w:t xml:space="preserve">“Mga bata para sa pintura, marahil,” sabi ko. “Ang iba pa, hindi ko pa masasabi nang tiyak.”</w:t>
       </w:r>
     </w:p>
     <w:p/>
@@ -1758,7 +1758,7 @@
     <w:p/>
     <w:p>
       <w:r>
-        <w:t xml:space="preserve">“Ginawa nga niya,” sabi ni Martha, at hinawakan ang tainga ni Snowball. Ang iba ay bumulong ng pagsang-ayon. Sa loob ng isang sandali, walang nanghula ng anuman, at isang troso ang tumira sa kalan.</w:t>
+        <w:t xml:space="preserve">“Karapat-dapat nga siya,” sabi ni Martha, at hinawakan ang tainga ni Snowball. Ang iba ay bumulong ng pagsang-ayon. Sa loob ng isang sandali, walang nanghula ng anuman, at isang troso ang tumira sa kalan.</w:t>
       </w:r>
     </w:p>
     <w:p/>
@@ -1788,7 +1788,7 @@
     <w:p/>
     <w:p>
       <w:r>
-        <w:t>Tumawid si Emma at lumuhod sa tabi ng pugad at hindi humawak, dahil tinuruan. Pinayagan ni Pip ang dalawang maingat na paghaplos sa kanyang likod at isang binulong na kumperensya na hindi ko kasali. Nagising si Snowball at lumapit upang sumandal sa tuhod ni Emma, nagseselos, at tumawa si Martha ng kanyang mahinang tawa sa kanilang dalawa.</w:t>
+        <w:t>Tumawid si Emma at lumuhod sa tabi ng pugad at hindi nanghablot, dahil tinuruan. Pinayagan ni Pip ang dalawang maingat na paghaplos sa kanyang likod at isang binulong na kumperensya na hindi ko kasali. Nagising si Snowball at lumapit upang sumandal sa tuhod ni Emma, nagseselos, at tumawa si Martha ng kanyang mahinang tawa sa kanilang dalawa.</w:t>
       </w:r>
     </w:p>
     <w:p/>
@@ -1913,13 +1913,13 @@
     <w:p/>
     <w:p>
       <w:r>
-        <w:t xml:space="preserve">“Hindi ko ito sinasadyang hanapin,” aniya habang tinatanggal ang huling pako at ininisod ang likurang tabla. “Inaayos mo ang mga talaan ng buwis, mga katitikan ng simbahan, at mga kasulatan — ang tuyong buto ng isang bayan. Walang hinahanap kundi kaayusan. At saka...” Iniharap niya ang drowing sa lampara. “...at saka mo binaligtad ang isang bagay.”</w:t>
-      </w:r>
-    </w:p>
-    <w:p/>
-    <w:p>
-      <w:r>
-        <w:t xml:space="preserve">May sulat sa likod ng drowing. Ang harap ay isang larawang nakita ko na ang isandaang bersyon: isang matigas na guhit-lapis ng mga taong nagtatag sa harap ng isang bagong gusali, hindi nakangiti, ginuhit ng isang taong mas matiyaga kaysa mahusay. Ngunit may sumulat sa likod, sa isang pino at nakahilig na sulat-kamay na naging kayumanggi na ang kulay sa paglipas ng mga taon, at iniikot ito ni Theo para mabasa ko.</w:t>
+        <w:t xml:space="preserve">“Hindi ko ito sinasadyang hanapin,” aniya habang tinatanggal ang huling pako at inangat ang likurang tabla. “Inaayos mo ang mga talaan ng buwis, mga katitikan ng simbahan, at mga kasulatan — ang tuyong buto ng isang bayan. Walang hinahanap kundi kaayusan. At saka...” Iniharap niya ang drowing sa lampara. “...at saka mo binaligtad ang isang bagay.”</w:t>
+      </w:r>
+    </w:p>
+    <w:p/>
+    <w:p>
+      <w:r>
+        <w:t xml:space="preserve">May sulat sa likod ng drowing. Ang harap ay isang larawang nakita ko na ang isandaang bersyon: isang matigas na guhit-lapis ng mga taong nagtatag sa harap ng isang bagong gusali, hindi nakangiti, ginuhit ng isang taong mas matiyaga kaysa mahusay. Ngunit may sumulat sa likod, sa isang pino at nakahilig na sulat-kamay na naging kayumanggi na ang kulay sa paglipas ng mga taon, at inikot ito ni Theo para mabasa ko.</w:t>
       </w:r>
     </w:p>
     <w:p/>
@@ -2036,7 +2036,7 @@
     <w:p/>
     <w:p>
       <w:r>
-        <w:t xml:space="preserve">Hinayaan ko siyang angkinin ang kababaang-loob na iyon, sapagkat totoo naman. Ngunit nakita ko kung paano niya tinanggihang angkinin kahit ang isang pulgadang hindi sa kanya. Noong Oktubre, si Theo Hussein ay umabot sa kabila ng nararapat at kumuha ng hindi sa kanya, para sa isang dahilan na halos mabuti ngunit sa pamamagitan ng paraang lubos na mali. Nagkakahalaga iyon sa kanya ng kanyang posisyon bilang pinuno ng Society na mahal niya, at halos nawalan siya ng buong paggalang ng bayan. Ngayon ay hindi na niya kukunin kahit ang maliit at tapat na kredito ng isang masuwerteng pagtuklas. Alam na alam niya kung gaano kalayo ang mararating ng isang maling hakbang, kaya naman maingat siyang naglakad. Hinayaan ko itong lumipas nang walang papuri. Humiling siya, nang hindi direktang sinasabi, na huwag purihin.</w:t>
+        <w:t xml:space="preserve">Hinayaan ko siyang angkinin ang kababaang-loob na iyon, sapagkat totoo naman. Ngunit nakita ko kung paano niya tinanggihang angkinin kahit ang isang pulgadang hindi sa kanya. Noong Oktubre, si Theo Hussein ay umabot sa kabila ng nararapat at kumuha ng hindi sa kanya, para sa isang dahilan na halos mabuti ngunit sa pamamagitan ng paraang lubos na mali. Iyon ang nagpawala sa kanya ng kanyang posisyon bilang pinuno ng Society na mahal niya, at halos nawalan siya ng buong paggalang ng bayan. Ngayon ay hindi na niya kukunin kahit ang maliit at tapat na kredito ng isang masuwerteng pagtuklas. Alam na alam niya kung gaano kalayo ang mararating ng isang maling hakbang, kaya naman maingat siyang naglakad. Hinayaan ko itong lumipas nang walang papuri. Humiling siya, nang hindi direktang sinasabi, na huwag purihin.</w:t>
       </w:r>
     </w:p>
     <w:p/>
@@ -2170,7 +2170,7 @@
     <w:p/>
     <w:p>
       <w:r>
-        <w:t>Tumama iyon sa kanya kung saan ko ito pinatama, at ang mukha ni Pete ay lumuwag tungo sa payak na kasiyahan ng kanyang kalakal. Lumibot siya sa lalagyan at tinimbang ang isang may marmol na hiwa ng balakang laban sa chuck na nasa tabi nito, tapat na tapat tulad ng isang timbangan. Pagkatapos ay itinuro niya ako patungo sa mas murang hiwa, dahil mas mabisa nitong gagawin ang trabaho at hinding-hindi niya ako ibebenta ng mahal kung ang mura ang tama. Si Pip, na sumunod sa aking takong at umikot sa pinagkatamang kahoy sakaling may naiwan doon na karapat-dapat sa atensiyon ng isang penguin, ay nakitang malungkot na walis ang establisimyento. Tumayo siya sa tabi ng counter na may hitsura ng isang kustomer na nadismaya sa serbisyo.</w:t>
+        <w:t>Tumama iyon sa kanya kung saan ko ito pinatama, at ang mukha ni Pete ay lumuwag tungo sa payak na kasiyahan ng kanyang kalakal. Lumibot siya sa lalagyan at tinimbang ang isang may marmol na hiwa ng balakang laban sa chuck na nasa tabi nito, tapat na tapat tulad ng isang timbangan. Pagkatapos ay itinuro niya ako patungo sa mas murang hiwa, dahil mas mabisa nitong gagawin ang trabaho at hinding-hindi niya ako pagbebentahan nang mahal kung ang mura ang tama. Si Pip, na sumunod sa aking takong at umikot sa pinagkatamang kahoy sakaling may naiwan doon na karapat-dapat sa atensiyon ng isang penguin, ay nakitang nakalulungkot na malinis na nawalisan ang establisimyento. Tumayo siya sa tabi ng counter na may hitsura ng isang kustomer na nadismaya sa serbisyo.</w:t>
       </w:r>
     </w:p>
     <w:p/>
@@ -2206,7 +2206,7 @@
     <w:p/>
     <w:p>
       <w:r>
-        <w:t xml:space="preserve">“Oo nga pala.” Humihila siya ng isang loop nang mahigpit. “At nagpasya ang buong kalye kung aling pinto ito dapat isisi. Ito ang nasa kabila ng liwasan na may pangalan ko sa itaas.” Sinabi niya ito nang patag, ang sama ng loob ay nakabalandra sa harap niya, may hinanakit at malakas, isang sakit na dadalhin niya sa gitna ng abenida sa tanghali kaysa itabi nang lihim. “Sige. Narinig na ninyo. Si Pete Garcia at ang dakong-kargahan, ang kadena sa tarangkahan, may galit sa kanya mula pa noong tag-init. Kaya sino pa nga ba.”</w:t>
+        <w:t xml:space="preserve">“Oo nga pala.” Hinila niya nang mahigpit ang isang loop. “At nagpasya ang buong kalye kung aling pinto ito dapat isisi. Ito ang nasa kabila ng liwasan na may pangalan ko sa itaas.” Sinabi niya ito nang patag, ang sama ng loob ay nakabalandra sa harap niya, may hinanakit at malakas, isang sakit na dadalhin niya sa gitna ng abenida sa tanghali kaysa itabi nang lihim. “Sige. Narinig na ninyo. Si Pete Garcia at ang dakong-kargahan, ang kadena sa tarangkahan, may galit sa kanya mula pa noong tag-init. Kaya sino pa nga ba.”</w:t>
       </w:r>
     </w:p>
     <w:p/>
@@ -2292,7 +2292,7 @@
         <w:t xml:space="preserve">siyempre, Pete, alam naming naroon ka, iyon naman ang punto.</w:t>
       </w:r>
       <w:r>
-        <w:t xml:space="preserve"> Kapag ikaw ay pinaghihinalaan, walang gustong makinig sa nakita mo.” Itinulak niya ang litson, maayos ang pagkakatali ng pisi, eksakto ang pagkakatupi ng papel. “Kaya hindi. Wala akong sinabihan. Sinasabi ko ito sa inyo dahil pumasok kayo rito para bumili ng litson at hindi para balatan ako. Anuman ang ginagawa sa babaeng iyon, hindi ako ang may gawa, at sawa na ako sa kalahati ng kalsadang ito na medyo naniniwalang ginawa ko nga. Kung kayo ang nag-iikot na bukas ang mga mata, narito ang nakita ng aking bukas na mga mata. Gawin ninyo ang gusto ninyo rito.”</w:t>
+        <w:t xml:space="preserve"> Kapag ikaw ay pinaghihinalaan, walang gustong makinig sa nakita mo.” Itinulak niya ang litson, maayos ang pagkakatali ng pisi, eksakto ang pagkakatupi ng papel. “Kaya hindi. Wala akong sinabihan. Sinasabi ko ito sa inyo dahil pumasok kayo rito para bumili ng litson at hindi para balatan ako. Anuman ang ginagawa sa babaeng iyon, hindi ako ang may gawa, at sawa na ako na ang buong kalsadang ito ay kalahating naniniwalang ginawa ko nga. Kung kayo ang nag-iikot na bukas ang mga mata, narito ang nakita ng aking bukas na mga mata. Gawin ninyo ang gusto ninyo rito.”</w:t>
       </w:r>
     </w:p>
     <w:p>
@@ -2302,7 +2302,7 @@
     </w:p>
     <w:p>
       <w:r>
-        <w:t xml:space="preserve">“May mga bakas ng bota sa paligid ng kanyang baitang, pagdating ng liwanag,” sabi ni Pete. “Sinabi ko sa sarili ko na sa mga naghahatid iyon, o sa kanya, o sa akin na nailipat ng tapak. Sa isang bakurang ganoon kaabala, ang mga bakas ay bakas lamang.” Tiningnan niya ako, direkta na ngayon, isang lalaking naglalabas ng bagay na hindi niya maibaba saanman. “Pero hindi laging iyon kung saan nagaganap ang trabaho. May ilang umaga na nakapwesto sila nang malapit sa pader niya, sa ilalim ng bintana, kung saan walang dahilan para tumayo maliban kung nag-iingat kang hindi makita mula sa kalye.” Nagkibit-balikat siya, mabigat. “O maliban kung ikaw ang magkakatay na may imbakan sa likod na nag-imbento ng anino para iligtas ang iyong sarili. Alam ko kung paano pakinggan. Narinig ko kung paano pakinggan ang bawat sinasabi ko nitong mga huling araw.”</w:t>
+        <w:t xml:space="preserve">“May mga bakas ng bota sa paligid ng kanyang baitang, pagdating ng liwanag,” sabi ni Pete. “Sinabi ko sa sarili ko na sa mga naghahatid iyon, o sa kanya, o sa akin na nailipat ng tapak. Sa isang bakurang ganoon kaabala, ang mga bakas ay bakas lamang.” Tiningnan niya ako, direkta na ngayon, isang lalaking naglalabas ng bagay na hindi niya maibaba saanman. “Pero hindi laging iyon kung saan nagaganap ang trabaho. May ilang umaga na nakapwesto sila nang malapit sa pader niya, sa ilalim ng bintana, kung saan walang dahilan para tumayo maliban kung nag-iingat kang hindi makita mula sa kalye.” Nagkibit-balikat siya, mabigat. “O maliban kung ikaw ang magkakatay na may imbakan sa likod na nag-imbento ng anino para iligtas ang iyong sarili. Alam ko kung ano ang dating nito. Narinig ko na kung ano ang dating ng bawat sinasabi ko nitong mga huling araw.”</w:t>
       </w:r>
     </w:p>
     <w:p>
@@ -2447,7 +2447,7 @@
     </w:p>
     <w:p>
       <w:r>
-        <w:t>Walang kailangang itama. Hindi mo masasabi sa isang babae na nagpapainit ng kanyang mga kamay sa kape ni Kelly na ang mga taong-niyebe sa kanyang bayan ay gumising sa gitna ng gabi at naglakad para maghanap ng isang bagay. Ang mahika ng Pasko ay malaya sa mga lansangan. Malaya, at nag-iisa, at hindi pa nito alam kung paano tumahimik. Kaya't ininom ko ang aking kape at namangha sa iba pa, at ginawa ko ang palagi kong ginagawa, at iyon ay ang magbilang.</w:t>
+        <w:t>Walang kailangang itama. Hindi mo masasabi sa isang babae na nagpapainit ng kanyang mga kamay sa kape ni Kelly na ang mga taong-niyebe sa kanyang bayan ay gumising sa gitna ng gabi at naglakad para maghanap ng isang bagay. Ang mahika ng Pasko ay malaya sa mga lansangan. Malaya, at nag-iisa, at hindi pa nito alam kung paano tumahimik. Kaya't ininom ko ang aking kape at namanghang kasama ng iba, at ginawa ko ang palagi kong ginagawa, at iyon ay ang magbilang.</w:t>
       </w:r>
     </w:p>
     <w:p>
@@ -2462,7 +2462,7 @@
     </w:p>
     <w:p>
       <w:r>
-        <w:t>Iyon ang isa na hindi sumandal sa iba ang nagpatigil sa akin.</w:t>
+        <w:t>Ang isang hindi sumandal kasabay ng iba ang nagpatigil sa akin.</w:t>
       </w:r>
     </w:p>
     <w:p>
@@ -2565,7 +2565,7 @@
     <w:p/>
     <w:p>
       <w:r>
-        <w:t xml:space="preserve">Binalak kong ikuwento sa kanya ang tungkol sa nag-iisa roon sa tapat ng botika, nakaharap palayo sa kinaroroonan ng iba na nakahilig. Pagkatapos ay tiningnan ko ang apuyan na nagniningning sa matiyagang panloob na init nito, ang lahat ng maluwag at nag-iisa na mahikang iyon na nakabitin sa ibabaw ng rehas, sumasandal pauwi, at hindi ko maibagsak ang malamig at kakaibang katotohanan ng taong-niyebe na iyon sa gitna nito. Hindi hanggang sa mas maunawaan ko ito nang sarili ko. Kaya hinayaan ko itong manatili sa iba pang mga bagay na hindi ko pa maunawaan, at hinayaan kong painitin ng aking asawa ang aking mga kamay sa kakaiba at mabait nitong apoy.</w:t>
+        <w:t xml:space="preserve">Binalak kong ikuwento sa kanya ang tungkol sa nag-iisa roon sa may parmasya, nakaharap palayo sa kinaroroonan ng iba na nakahilig. Pagkatapos ay tiningnan ko ang apuyan na nagniningning sa matiyagang panloob na init nito, ang lahat ng maluwag at nag-iisa na mahikang iyon na nakabitin sa ibabaw ng rehas, sumasandal pauwi, at hindi ko maibagsak ang malamig at kakaibang katotohanan ng taong-niyebe na iyon sa gitna nito. Hindi hanggang sa mas maunawaan ko ito nang sarili ko. Kaya hinayaan ko itong manatili sa iba pang mga bagay na hindi ko pa maunawaan, at hinayaan kong painitin ng aking asawa ang aking mga kamay sa kakaiba at mabait nitong apoy.</w:t>
       </w:r>
     </w:p>
     <w:p/>
@@ -2738,7 +2738,7 @@
     <w:p/>
     <w:p>
       <w:r>
-        <w:t xml:space="preserve">“Hindi ko masabi kung sino. Sasabihin ko sa inyo ito, dahil tumatak sa lalamunan ko.” Tumango siya pabalik sa dilaw na papel. “Karamihan sa mga reklamong natatanggap ko ay mula sa isang baliw na kapitbahay o isang maarte na kostumer, at mababasa mo iyon. </w:t>
+        <w:t xml:space="preserve">“Hindi ko masabi kung sino. Sasabihin ko sa inyo ito, dahil talagang ikinainis ko ito.” Tumango siya pabalik sa dilaw na papel. “Karamihan sa mga reklamong natatanggap ko ay mula sa isang baliw na kapitbahay o isang maarte na kostumer, at mababasa mo iyon. </w:t>
       </w:r>
       <w:r>
         <w:rPr>
@@ -2747,19 +2747,19 @@
         <w:t xml:space="preserve">May amoy. May nakita akong daga. Hilaw ang gitna ng tinapay ko.</w:t>
       </w:r>
       <w:r>
-        <w:t xml:space="preserve"> Damdamin, kadalasan, kalahati ay panlalait, at inaayos ko ang panlalait sa pintuan bago ko buksan ang aking maleta.” Inayos niya ang kaniyang sumbrero. “Hindi ganoon ang dating ng isang ito. Dumating ito na nakatipa, at binanggit ang mga sub-seksyon. Binanggit sa akin ang eksaktong kodigo sa temperatura ng lababong panghugas-kamay, kabanata at seksyon. Binanggit ang semento at ang puwang ng pinto sa mga salita ng kalakalan bago pa man ako tumapak sa loob, na para bang nagbabasa ng isang listahan mula sa aking manwal. Tinawag ang palamigan na ‘ang malamig na silid,’ na para bang ito ay isang pangalan, at ang lababong panghugas-kamay na ‘ang lababong Hobart.’ Kung sino man ang sumulat nito ay alam kung para saan isinusulat ang isang komersyal na kusina, alam na alam ito, at alam kung saan eksaktong may mga pudpod na bahagi ang isang lumang gusali.” Binuksan niya ang pinto patungo sa lamig. “Ang isang taong ganoon kakilala ang kodigo ay kadalasang hindi ang naghahain. Karaniwan ay may sarili silang kusina na pinapangalagaan.”</w:t>
-      </w:r>
-    </w:p>
-    <w:p/>
-    <w:p>
-      <w:r>
-        <w:t>At tinanguan niya ang sumbrero kay Greta, na hindi ito nakita, at lumabas sa niyebe, at ang kampana ay tumunog sa likod niya at natahimik.</w:t>
-      </w:r>
-    </w:p>
-    <w:p/>
-    <w:p>
-      <w:r>
-        <w:t xml:space="preserve">Tumayo si Greta sa lagayan na ang dilaw na papel ay nasa ilalim ng kaniyang mga kamay. Tumigil ang mga ito dito nang sabihin niya ang “malamig na silid.” Nakita ko ito sa ibabaw ng kaniyang balikat. Walang sinabi si Greta, at hindi ako nagtanong.</w:t>
+        <w:t xml:space="preserve"> Damdamin, kadalasan, kalahati ay panlalait, at inaayos ko ang panlalait sa pintuan bago ko buksan ang aking maleta.” Inayos niya ang kaniyang sumbrero. “Hindi ganoon ang dating ng isang ito. Dumating ito na nakatipa, at binanggit ang mga sub-seksyon. Binanggit sa akin ang eksaktong kodigo sa temperatura ng lababong panghugas-kamay, kabanata at seksyon. Binanggit ang semento at ang puwang ng pinto sa mga salita ng kalakalan bago pa man ako tumapak sa loob, na para bang nagbabasa ng isang listahan mula sa aking manwal. Tinawag ang palamigan na ‘ang malamig na silid,’ na para bang ito ay isang pangalan, at ang lababong panghugas-kamay na ‘ang lababong Hobart.’ Kung sino man ang sumulat nito ay alam kung sa ano-anong bagay nasisita ang isang komersyal na kusina, alam na alam ito, at alam kung saan eksaktong may mga pudpod na bahagi ang isang lumang gusali.” Binuksan niya ang pinto patungo sa lamig. “Ang isang taong ganoon kakilala ang kodigo ay kadalasang hindi ang naghahain. Karaniwan ay may sarili silang kusina na pinapangalagaan.”</w:t>
+      </w:r>
+    </w:p>
+    <w:p/>
+    <w:p>
+      <w:r>
+        <w:t>At hinawakan niya ang kaniyang sumbrero bilang pamamaalam kay Greta, na hindi ito nakita, at lumabas sa niyebe, at ang kampana ay tumunog sa likod niya at natahimik.</w:t>
+      </w:r>
+    </w:p>
+    <w:p/>
+    <w:p>
+      <w:r>
+        <w:t xml:space="preserve">Tumayo si Greta sa lagayan na ang dilaw na papel ay nasa ilalim ng kaniyang mga kamay. Tumigil ang mga ito dito nang sabihin niya ang “ang malamig na silid.” Nakita ko ito sa ibabaw ng kaniyang balikat. Walang sinabi si Greta, at hindi ako nagtanong.</w:t>
       </w:r>
     </w:p>
     <w:p/>
@@ -2908,7 +2908,7 @@
     <w:p/>
     <w:p>
       <w:r>
-        <w:t xml:space="preserve">“At inaabot sila ng pamimigay ng pagkain.”</w:t>
+        <w:t xml:space="preserve">“At naaabot sila ng kampanya para sa pagkain.”</w:t>
       </w:r>
     </w:p>
     <w:p/>
@@ -2956,7 +2956,7 @@
     <w:p/>
     <w:p>
       <w:r>
-        <w:t xml:space="preserve">“Ako si Ginang Claus,” sabi ko. “Pinaakyat ako ni Hal dala ang harinang utang ko sa kanya, at ayaw niya akong payagang umalis nang walang natitira, at mabigat ito, at matanda na ako, kaya gagawa ka sa akin ng kabaitan na kunin ito mula sa aking mga braso bago ko ibagsak ang iyong tsaa sa niyebe.”</w:t>
+        <w:t xml:space="preserve">“Ako si Ginang Claus,” sabi ko. “Pinaakyat ako ni Hal dala ang harinang utang ko sa kanya, at ayaw niya akong payagang umalis nang hindi dala ang iba pa, at mabigat ito, at matanda na ako, kaya gagawa ka sa akin ng kabaitan na kunin ito mula sa aking mga braso bago ko ibagsak ang iyong tsaa sa niyebe.”</w:t>
       </w:r>
     </w:p>
     <w:p/>
@@ -3240,13 +3240,13 @@
     <w:p/>
     <w:p>
       <w:r>
-        <w:t xml:space="preserve">Hindi ka makakabili ng maasim na base kada sako mula sa istante ng tindahan. Nagmula ito sa pinagkukunan ng mga panadero, sa pamamagitan ng account, sa mga taong kilala sa industriya. Hindi rin ito maaaring tantiyahin lamang sa pamamagitan ng mata. Kapag kulang ng isang kurot, walang epekto. Ang isang dakot na labis ay nagpapatapang sa amoy ng hilaw na harina sa sandaling buksan ang sako, at itatapon ito ng sinumang panadero. Upang sirain siya at panatilihing mukhang at amoy maayos ang harina kaya't apat na beses siyang nag-bake nito, apat na beses sa malinis na timpla at sariwang sako ng pampaalsa habang naghahanap siya ng depektong kailanman ay hindi nanggaling sa kanyang mga kamay, ay nangangailangan ng kaalaman sa eksaktong maling dami. Kaalaman iyon ng industriya, hindi galit ng isang kapitbahay. Kasintulad ito ng nakatipang reklamo na nagbabanggit ng mga sub-seksyon, ng kamay na alam na alam ang kodigo ng lababong panghugas-kamay. Ang parehong kaalaman, na ginamit na ngayon nang dalawa, sa dalawang magkaibang sandata.</w:t>
-      </w:r>
-    </w:p>
-    <w:p/>
-    <w:p>
-      <w:r>
-        <w:t xml:space="preserve">Hindi ko pa nakikita ang mukha nito, bagaman gagawin iyon ng bayan. Ngunit ang lupa sa ilalim ng tanong ay gumalaw habang nakatayo ako sa baitang ni Doc. Ang nangyari sa mga niluto ni Greta ay nasagot na, sa loob ng isang garapon ng pang-imbak sa aking amerikana. Ang natitira na lamang ay kung sino sa abenidang ito ang nakalapit sa harinang iyon at alam ang eksaktong dami para sirain ito.</w:t>
+        <w:t xml:space="preserve">Hindi ka makakabili ng maasim na base kada sako mula sa istante ng tindahan. Nagmula ito sa pinagkukunan ng mga panadero, sa pamamagitan ng account, sa mga taong kilala sa industriya. Hindi rin ito maaaring tantiyahin lamang sa pamamagitan ng mata. Kapag kulang ng isang kurot, walang epekto. Ang isang dakot na labis ay nagpapatapang sa amoy ng hilaw na harina sa sandaling buksan ang sako, at itatapon ito ng sinumang panadero. Upang sirain siya at panatilihing mukhang at amoy maayos ang harina kaya't apat na beses siyang nag-bake nito, apat na beses sa malinis na timpla at sariwang sako ng pampaalsa habang naghahanap siya ng depektong kailanman ay hindi nanggaling sa kanyang mga kamay, ay nangangailangan ng kaalaman sa eksaktong maling dami. Kaalaman iyon ng industriya, hindi galit ng isang kapitbahay. Kasintulad ito ng nakatipang reklamo na nagbabanggit ng mga sub-seksyon, ng kamay na alam na alam ang kodigo ng lababong panghugas-kamay. Ang parehong kaalaman, na ginamit na ngayon nang dalawang beses, sa dalawang magkaibang sandata.</w:t>
+      </w:r>
+    </w:p>
+    <w:p/>
+    <w:p>
+      <w:r>
+        <w:t xml:space="preserve">Hindi ko pa ito binigyan ng mukha, bagaman gagawin iyon ng bayan. Ngunit ang lupa sa ilalim ng tanong ay gumalaw habang nakatayo ako sa baitang ni Doc. Ang nangyari sa mga niluto ni Greta ay nasagot na, sa loob ng isang garapon ng pang-imbak sa aking amerikana. Ang natitira na lamang ay kung sino sa abenidang ito ang nakalapit sa harinang iyon at alam ang eksaktong dami para sirain ito.</w:t>
       </w:r>
     </w:p>
     <w:p/>
@@ -3365,7 +3365,7 @@
     <w:p/>
     <w:p>
       <w:r>
-        <w:t xml:space="preserve">Ang eskinita sa likod ng mga tindahan sa Evergreen ay tumatakbo sa buong haba ng bloke, isang nilinis na daanan sa pagitan ng mga likod ng mga tindahan at ng mababang pader ng mga lote sa likuran nila. Sapat ang luwang para sa nag-iisang van at wala nang iba pa. Binagtas ko ito nang mabagal sa patag na liwanag ng umaga, si Pip ay nasa aking sakong tahimik at maingat, at binasa ko ang mga likod ng mga tindahan sa paraang hindi ko kailanman ginawa. Bilang mga pintuan sa halip na mga pader. Narito ang pintong bakal ng botika, na nakakandado, may kampanilya rito. At narito ang dalawang naghahati sa dakong-kargahan. Ang imbakang pinalalamig ni Pete, isang lumang gusaling gawa sa bloke na may mabigat na aldaba, at ang pangalawang kandado na binili niya kay Tom na makintab at bago sa tarangkahan. At tatlong pintuan ang layo, kay Greta, mababa at gawa sa kahoy, pumuti na ang hawakan dahil sa apatnapung taon ng paghawak ng kamay na may harina.</w:t>
+        <w:t xml:space="preserve">Ang eskinita sa likod ng mga tindahan sa Evergreen ay tumatakbo sa buong haba ng bloke, isang nilinis na daanan sa pagitan ng mga likod ng mga tindahan at ng mababang pader ng mga lote sa likuran nila. Sapat ang luwang para sa nag-iisang van at wala nang iba pa. Binagtas ko ito nang mabagal sa patag na liwanag ng umaga, si Pip ay nasa aking sakong tahimik at maingat, at binasa ko ang mga likod ng mga tindahan sa paraang hindi ko kailanman ginawa. Bilang mga pintuan sa halip na mga pader. Narito ang pintong bakal ng parmasya, na nakakandado, may kampanilya rito. At narito ang dalawang naghahati sa dakong-kargahan. Ang imbakang pinalalamig ni Pete, isang lumang gusaling gawa sa bloke na may mabigat na aldaba, at ang pangalawang kandado na binili niya kay Tom na makintab at bago sa tarangkahan. At tatlong pintuan ang layo, kay Greta, mababa at gawa sa kahoy, pumuti na ang hawakan dahil sa apatnapung taon ng paghawak ng kamay na may harina.</w:t>
       </w:r>
     </w:p>
     <w:p/>
@@ -3389,7 +3389,7 @@
     <w:p/>
     <w:p>
       <w:r>
-        <w:t>Hindi sumagot si Pip. Naging tahimik siya laban sa aking bukung-bukong. Ganoon siya kapag mas malapit ang gulo kaysa sa lakas ng loob kong aminin. Tumitingin siya sa lampas ko, tatlong pintuan ang layo, sa bagong makinang na kandado sa tarangkahan ng magkakatay.</w:t>
+        <w:t>Hindi sumagot si Pip. Naging tahimik siya laban sa aking bukung-bukong. Ganoon siya kapag mas malapit ang gulo kaysa sa lakas ng loob kong aminin. Nakatingin siya lampas sa akin, tatlong pintuan ang layo, sa bagong makinang na kandado sa tarangkahan ng magkakatay.</w:t>
       </w:r>
     </w:p>
     <w:p/>
@@ -3586,7 +3586,7 @@
     <w:p/>
     <w:p>
       <w:r>
-        <w:t>Natagpuan ko siya sa kaniyang bloke nang hindi pa bukas ang tindahan, hinahati ang tagiliran ng umaga, at dumiretso siya nang tumunog ang kampana at inilatag nang patag ang kaniyang kutsilyo, handa, tulad ng paghahanda niya noong unang pagkakataon, isang lalaking nasanay nang umasa ng iisang bagay mula sa mga pumapasok sa kaniyang pinto.</w:t>
+        <w:t>Natagpuan ko siya sa kaniyang bloke nang hindi pa bukas ang tindahan, hinahati ang tagiliran ng umaga, at tumuwid siya ng tayo nang tumunog ang kampana at inilatag nang patag ang kaniyang kutsilyo, handa, tulad ng paghahanda niya noong unang pagkakataon, isang lalaking nasanay nang umasa ng iisang bagay mula sa mga pumapasok sa kaniyang pinto.</w:t>
       </w:r>
     </w:p>
     <w:p/>
@@ -3622,7 +3622,7 @@
     <w:p/>
     <w:p>
       <w:r>
-        <w:t xml:space="preserve">“Iyong hugis na binanggit ko sa inyo,” wika niya habang ibinabalot ang hiniwang karne na hindi ko naman hiningi. “Sa pintuan niya sa likod sa dilim. Gusto ninyo yatang malaman ang buong detalye, ngayong naniniwala na kayo sa akin.” Inilapag niya ang kaniyang malalaking kamay nang patag sa tadtaran at tumingin sa labas ng bintana patungo sa mga harapan ng mga tindahan sa Evergreen sa kabilang dako ng liwasan, tila kaya niyang tanawin ang bakuran sa kabila ng mga iyon. “Isang taong nasa hustong gulang. Hindi basta bata, anuman ang gustong iparatang ng bayan sa sinumang binatilyong may dalang lata ng pintura. Mas matangkad kaysa kay Greta, at may tiyak na layunin sa pagkilos. Walang pagpapaliban. Walang pagpapainit ng mga kamay. Alam niya kung bakit siya naroon. At nakabalot. Isang mahabang amerikana, o isang balabal, maluwag, iyong isinusuot sa paggawa nang hindi nadudumihan, mapusyaw, halos masasabi ko, bagamat nilamon ng dilim ang kulay nito. Nakadikit sa dingding niya, kung saan dumadaan ang mga padala at walang marangal na lakad ang tumutungo. At nang sumilip ang mga ilaw ng aking sasakyan ay naglaho ito, mabilis at tahimik, hindi sa pamamagitan ng pagmamadali kundi sa pag-alis. Walang pagkaapurahan. Tapos na at naglaho.” Umiling siya sa kaniyang abuhing ulo. “Walang mukha. Kailanman ay walang mukha rito. Isang kumikilos na hugis lamang, nag-iingat na hindi mamataan, na mas kabisado ang mga oras ni Greta kaysa sa nararapat sa isang estranghero.” Tinalian niya ang papel. “Iyong van na iyon muli, isang umaga. Nakaparada malapit sa botika, tumutunog ang makina. Mataas ang bubong, mas mataas kaysa sa kinakailangan ng isang van, na may guhit ng pulang reflector tape sa mga pintuan sa likod. Maliwanag na parang Pasko nang tamaan ng mga ilaw ng aking sasakyan.”</w:t>
+        <w:t xml:space="preserve">“Iyong hugis na binanggit ko sa inyo,” wika niya habang ibinabalot ang hiniwang karne na hindi ko naman hiningi. “Sa pintuan niya sa likod sa dilim. Gusto ninyo yatang malaman ang buong detalye, ngayong naniniwala na kayo sa akin.” Inilapag niya ang kaniyang malalaking kamay nang patag sa tadtaran at tumingin sa labas ng bintana patungo sa mga harapan ng mga tindahan sa Evergreen sa kabilang dako ng liwasan, tila kaya niyang tanawin ang bakuran sa kabila ng mga iyon. “Isang taong nasa hustong gulang. Hindi basta bata, anuman ang gustong iparatang ng bayan sa sinumang binatilyong may dalang lata ng pintura. Mas matangkad kaysa kay Greta, at may tiyak na layunin sa pagkilos. Walang pagpapaliban. Walang pagpapainit ng mga kamay. Alam niya kung bakit siya naroon. At nakabalot. Isang mahabang amerikana, o isang balabal, maluwag, iyong isinusuot sa paggawa nang hindi nadudumihan, mapusyaw, halos masasabi ko, bagamat nilamon ng dilim ang kulay nito. Nakadikit sa dingding niya, kung saan dumadaan ang mga padala at walang marangal na lakad ang tumutungo. At nang sumilip ang mga ilaw ng aking sasakyan ay naglaho ito, mabilis at tahimik, hindi sa pamamagitan ng pagmamadali kundi sa pag-alis. Walang pagkaapurahan. Tapos na at naglaho.” Umiling siya sa kaniyang abuhing ulo. “Walang mukha. Kailanman ay walang mukha rito. Isang kumikilos na hugis lamang, nag-iingat na hindi mamataan, na mas kabisado ang mga oras ni Greta kaysa sa nararapat sa isang estranghero.” Tinalian niya ang papel. “Iyong van na iyon muli, isang umaga. Nakaparada malapit sa parmasya, tumutunog ang makina. Mataas ang bubong, mas mataas kaysa sa kinakailangan ng isang van, na may guhit ng pulang reflector tape sa mga pintuan sa likod. Maliwanag na parang Pasko nang tamaan ng mga ilaw ng aking sasakyan.”</w:t>
       </w:r>
     </w:p>
     <w:p/>
@@ -3699,7 +3699,7 @@
     <w:p/>
     <w:p>
       <w:r>
-        <w:t xml:space="preserve">Nalaman ko ito kay Claire, na dumaan sa aming landas nang umagang iyon, hindi nagtagal pagkauwi ko, kasama ang kuwaderno niyang nakasara ngayon at seryosong nakatikom ang bibig. Narinig niya ito sa botika. Ang mga taong nakapila roon ay nakuha ito sa mga bata sa liwasan, at nakuha naman ito ng mga bata sa mismong grupo ng mga naglalagi sa gabi, na may edad na labing-apat at hindi kayang maglihim magdamag. May kumakalat na pangalan para sa pintura sa dingding ni Greta. Ang pangalang iyon ay Danny Ott.</w:t>
+        <w:t xml:space="preserve">Nalaman ko ito kay Claire, na dumaan sa aming landas nang umagang iyon, hindi nagtagal pagkauwi ko, kasama ang kuwaderno niyang nakasara ngayon at seryosong nakatikom ang bibig. Narinig niya ito sa parmasya. Ang mga taong nakapila roon ay nakuha ito sa mga bata sa liwasan, at nakuha naman ito ng mga bata sa mismong grupo ng mga naglalagi sa gabi, na may edad na labing-apat at hindi kayang maglihim magdamag. May kumakalat na pangalan para sa pintura sa dingding ni Greta. Ang pangalang iyon ay Danny Ott.</w:t>
       </w:r>
     </w:p>
     <w:p/>
@@ -3759,13 +3759,13 @@
     <w:p/>
     <w:p>
       <w:r>
-        <w:t>Natagpuan ko si Danny Ott sa liwasan sa dapit-hapon, kung saan sinabi ng lahat na naroroon siya. Sa pagkakataong ito ay tama sila, bagama't mali ang aral na nakuha nila roon. Naroon siya sa dulo ng bantayog ng digmaan kasama ang iba pang kasamahan, na walang ginagawang masama kundi ang ginawin at maging labinlimang taong gulang na walang mapagkaabalahan sa dilim. Nang dumating ako, lumayo ang iba, ayaw madamay sa isang may sapat na gulang na may layunin. Si Danny ay hindi umalis. Nanatili siya sa tabi ng rehas, isang matangkad at payat na binata na may sukat ng amerikana na kapos sa pulso, na may matatag na anyo ng isang taong narinig ang mga sinasabi at alam na hindi niya ito kayang takasan.</w:t>
-      </w:r>
-    </w:p>
-    <w:p/>
-    <w:p>
-      <w:r>
-        <w:t xml:space="preserve">“Kayo po si Ginang Claus,” aniya. “Kayo ang nag-iimbestiga sa mga bagay-bagay.” Lumuwa ang laway niya sa lalamunan. “Hindi ko po pininturahan ang dingding niya.”</w:t>
+        <w:t>Natagpuan ko si Danny Ott sa liwasan sa dapit-hapon, kung saan sinabi ng lahat na naroroon siya. Sa pagkakataong ito ay tama sila, bagama't mali ang aral na nakuha nila roon. Naroon siya sa dulo ng bantayog ng digmaan kasama ang dalawa pang kasamahan sa grupo, na walang ginagawang masama kundi ang ginawin at maging labinlimang taong gulang na walang mapagkaabalahan sa dilim. Nang dumating ako, lumayo ang iba, ayaw madamay sa isang may sapat na gulang na may layunin. Si Danny ay hindi umalis. Nanatili siya sa tabi ng rehas, isang matangkad at payat na binata na may sukat ng amerikana na kapos sa pulso, na may matatag na anyo ng isang taong narinig ang mga sinasabi at alam na hindi niya ito kayang takasan.</w:t>
+      </w:r>
+    </w:p>
+    <w:p/>
+    <w:p>
+      <w:r>
+        <w:t xml:space="preserve">“Kayo po si Ginang Claus,” aniya. “Kayo ang nag-iimbestiga sa mga bagay-bagay.” Napalunok siya. “Hindi ko po pininturahan ang dingding niya.”</w:t>
       </w:r>
     </w:p>
     <w:p/>
@@ -3801,7 +3801,7 @@
     <w:p/>
     <w:p>
       <w:r>
-        <w:t xml:space="preserve">“Tanungin ninyo siya.” Tumingin siya sa kaniyang mga kamay. “Tanungin ninyo ang mga Petersen na dalawang bahay ang layo. Sila ang nagbantay sa mga kapatid ko sa loob ng isang oras na tumakbo ako sa botika bago ito magsara. Hindi ako maaaring mapunta sa dalawang lugar nang sabay. Pilit kong sinasabi sa mga tao, ngunit nakapagpasya na sila.” Lumitaw ang kapaitan nang bata at hilaw. “Dahil pinatigil ako ni Greta. Parang gagawin ko iyon sa kanya, sa lahat ng tindahan. Mabait siya sa akin. Siya lang ang nag-iisang tao rito na nagpasahod sa akin sa tamang oras at kailanman ay hindi kinulang.”</w:t>
+        <w:t xml:space="preserve">“Tanungin ninyo siya.” Tumingin siya sa kaniyang mga kamay. “Tanungin ninyo ang mga Petersen na dalawang bahay ang layo. Sila ang nagbantay sa mga kapatid ko sa loob ng isang oras na tumakbo ako sa parmasya bago ito magsara. Hindi ako maaaring mapunta sa dalawang lugar nang sabay. Pilit kong sinasabi sa mga tao, ngunit nakapagpasya na sila.” Lumitaw ang kapaitan nang bata at hilaw. “Dahil pinatigil ako ni Greta. Parang gagawin ko iyon sa kanya, sa lahat ng tindahan. Mabait siya sa akin. Siya lang ang nag-iisang tao rito na nagpasahod sa akin sa tamang oras at kailanman ay hindi kinulang.”</w:t>
       </w:r>
     </w:p>
     <w:p/>
@@ -3915,7 +3915,7 @@
     <w:p/>
     <w:p>
       <w:r>
-        <w:t xml:space="preserve">“Alam ko na,” sabi ni Claire, at binigyan ng dalawang guhit ang isang bagay sa ibaba. “Magsisimula ako sa botika sa umaga, dahil doon nagsimula ang lahat.”</w:t>
+        <w:t xml:space="preserve">“Alam ko na,” sabi ni Claire, at binigyan ng dalawang guhit ang isang bagay sa ibaba. “Magsisimula ako sa parmasya sa umaga, dahil doon nagsimula ang lahat.”</w:t>
       </w:r>
     </w:p>
     <w:p/>
@@ -4174,7 +4174,7 @@
     </w:p>
     <w:p>
       <w:r>
-        <w:t xml:space="preserve">“Magiging sapat ito,” sabi niya, mahina, halos hindi makapaniwala sa mga salita. “Ang Society. Walang nagtanong kahit isang dolyar at dumarating pa rin ang mga pangako. Sabi ni Matandang Ferris, retirado mula sa planta, itataguyod niya ang buong boiler kung ang bayan ang bahala sa bubong. Sasagipin nila ang lugar na ito, Jessica. Gamit ang sarili nilang mga kamay. Akala ko hindi ko na aabuting gusto nila ito nang ganito.”</w:t>
+        <w:t xml:space="preserve">“Magiging sapat ito,” sabi niya, mahina, halos hindi makapaniwala sa mga salita. “Ang Society. Walang humingi ng kahit isang dolyar at dumarating pa rin ang mga pangako. Sabi ni Matandang Ferris, retirado mula sa planta, itataguyod niya ang buong boiler kung ang bayan ang bahala sa bubong. Sasagipin nila ang lugar na ito, Jessica. Gamit ang sarili nilang mga kamay. Akala ko hindi ko na aabuting gusto nila ito nang ganito.”</w:t>
       </w:r>
     </w:p>
     <w:p>
@@ -4211,7 +4211,7 @@
     </w:p>
     <w:p>
       <w:r>
-        <w:t xml:space="preserve">Alam ko ang linggo na iyon. Alam ng lahat. Bumukas kahapon ang mga pinto, at si Ivy ay tumayo sa pila. Ang nagpapatigil sa akin ay naroroon sa sulok, kung saan tinatakan ng kalihim ng Grange ang papel ng lilang tinta, tulad ng ginagawa niya sa lahat ng pinapayagan niya sa kanyang pisara. Ibinaba ko iyon upang makasigurado. NAKAPASKIL, at isang petsa. Oktubre 30.</w:t>
+        <w:t xml:space="preserve">Alam ko ang linggo na iyon. Alam ng lahat. Bumukas kahapon ang mga pinto, at si Ivy ay tumayo sa pila. Ang nagpatigil sa akin ay naroroon sa sulok, kung saan tinatakan ng kalihim ng Grange ang papel ng lilang tinta, tulad ng ginagawa niya sa lahat ng pinapayagan niya sa kanyang pisara. Ibinaba ko iyon upang makasigurado. NAKAPASKIL, at isang petsa. Oktubre 30.</w:t>
       </w:r>
     </w:p>
     <w:p>
@@ -4309,12 +4309,12 @@
         <w:t xml:space="preserve">Pinatuyong asido. May naglagay niyan doon. At alam na alam nila kung gaano karami ang ilalagay.</w:t>
       </w:r>
       <w:r>
-        <w:t xml:space="preserve"> Isang asido, ang sabi niya, madali na parang panahon, sa isang bilog ng mga kababaihan sa tabi ng bariles ng pagkain. Isang pulbos na hinalo sa kanyang harina ayon sa kanyang utos ng isang tagapagtustos na maglalagay ng anumang hingin niya. Isang babae na alam hanggang sa bulong kung gaano karami ang kakayanin ng isang masa, at kaya alam kung magkano ang sisira dito.</w:t>
-      </w:r>
-    </w:p>
-    <w:p>
-      <w:r>
-        <w:t xml:space="preserve">Sinabi ni Doc na ang isang kusina ng pastry ay walang paggagamitan ng bagay sa lalagyan ni Greta. Ngunit siya ay negosyante, na may account sa isang malaking bahay-kalakal sa Portland na magpapadala sa kanya ng anumang isulat niya sa papel ng order. Ang ladrilyo sa mga baldosa ni Greta ay may lumang kulay-abong mortar dito, at ang tanging tumpok ng lumang ladrilyo sa bloke ay nasa malaking basurahan sa likod ng kanyang tindahan. At naroon ang linggo, sa aking kamay. Hindi tumayo si Doc dito at narinig siya.</w:t>
+        <w:t xml:space="preserve"> Isang asido, ang sabi niya, kasingdali ng pag-uusap tungkol sa panahon, sa isang bilog ng mga kababaihan sa tabi ng bariles ng pagkain. Isang pulbos na hinalo sa kanyang harina ayon sa kanyang utos ng isang tagapagtustos na maglalagay ng anumang hingin niya. Isang babae na alam hanggang sa bulong kung gaano karami ang kakayanin ng isang masa, at kaya alam kung magkano ang sisira dito.</w:t>
+      </w:r>
+    </w:p>
+    <w:p>
+      <w:r>
+        <w:t xml:space="preserve">Sinabi ni Doc na ang isang kusina ng pastry ay walang paggagamitan ng bagay sa lalagyan ni Greta. Ngunit kabilang siya sa industriya, na may account sa isang malaking bahay-kalakal sa Portland na magpapadala sa kanya ng anumang isulat niya sa papel ng order. Ang ladrilyo sa mga baldosa ni Greta ay may lumang kulay-abong mortar dito, at ang tanging tumpok ng lumang ladrilyo sa bloke ay nasa malaking basurahan sa likod ng kanyang tindahan. At naroon ang linggo, sa aking kamay. Hindi tumayo si Doc dito at narinig siya.</w:t>
       </w:r>
     </w:p>
     <w:p>
@@ -4390,7 +4390,7 @@
     <w:p/>
     <w:p>
       <w:r>
-        <w:t xml:space="preserve">Inayos ko na ang korona sa dilim habang natutulog si Nick, ang tanging dahilan na magpapalusot sa akin sa gintong pintuan niya nang walang maling tunog, dahil hindi naman iyon peke. Ang mga kababaihan ng bilog ay nagdekorasyon sa buong abenida para sa kapaskuhan, bawat pintuan ng tindahan dito, at ang bagong tindahan ay bagong pintuan. Ang hindi pag-aalok ng korona sa Sugarplum sa linggong binuksan ito ay magiging kahina-hinala. Kaya habang nasa balsam ang mga kamay ko ay gagawin ko ang isa ko pang sadya. Kilalanin siyang mabuti. Sapat ang lapit para mahuli kung saan nakalatag ang gayuma. Ganoon din ang ginawa ko kay Pete sa ibabaw ng kaniyang tadtaran.</w:t>
+        <w:t xml:space="preserve">Napagpasyahan ko na ang tungkol sa korona sa dilim habang natutulog si Nick, ang tanging dahilan na magpapalusot sa akin sa gintong pintuan niya nang walang maling tunog, dahil hindi naman iyon peke. Ang mga kababaihan ng bilog ay nagdekorasyon sa buong abenida para sa kapaskuhan, bawat pintuan ng tindahan dito, at ang bagong tindahan ay bagong pintuan. Ang hindi pag-aalok ng korona sa Sugarplum sa linggong binuksan ito ay magiging kahina-hinala. Kaya habang nasa balsam ang mga kamay ko ay gagawin ko ang isa ko pang sadya. Kilalanin siyang mabuti. Sapat ang lapit para mahuli kung ano ang nasa ilalim ng kaniyang alindog. Ganoon din ang ginawa ko kay Pete sa ibabaw ng kaniyang tadtaran.</w:t>
       </w:r>
     </w:p>
     <w:p/>
@@ -4504,7 +4504,7 @@
     <w:p/>
     <w:p>
       <w:r>
-        <w:t xml:space="preserve">“Negosyo ko ito.” Sinabi niya ito nang walang kurap. “Alam ng isa kung para saan sinusulat ang isang komersyal na kusina, tulad ng pag-alam mo sa mga piyesa ng iyong sasakyan. Ang mga temperatura, ang mga selyo, ang tubig. Iyon ang kalahating nakakainip sa gawain, at ang kalahating nagpapasara sa iyo kung pababayaan mo ito.” Ngumiti siya, marangal at walang butas, nang walang tahi na masusunggaban ng aking kuko. “Dumaan na ako sa aking mga inspeksyon sa tatlong lungsod. Kinakabisado mo ang kodigo. O hindi ka mabubuhay. Sana ay maayos niya ito. Mahirap na negosyo ang matalo sa iyong sariling mga tubo.”</w:t>
+        <w:t xml:space="preserve">“Negosyo ko ito.” Sinabi niya ito nang walang kurap. “Alam ng isa kung sa ano-anong bagay nasisita ang isang komersyal na kusina, tulad ng pag-alam mo sa mga piyesa ng iyong sasakyan. Ang mga temperatura, ang mga selyo, ang tubig. Iyon ang kalahating nakakainip sa gawain, at ang kalahating nagpapasara sa iyo kung pababayaan mo ito.” Ngumiti siya, marangal at walang butas, nang walang tahi na masusunggaban ng aking kuko. “Dumaan na ako sa aking mga inspeksyon sa tatlong lungsod. Kinakabisado mo ang kodigo. O hindi ka mabubuhay. Sana ay maayos niya ito. Mahirap na negosyo ang matalo sa iyong sariling mga tubo.”</w:t>
       </w:r>
     </w:p>
     <w:p/>
@@ -4953,13 +4953,13 @@
     <w:p/>
     <w:p>
       <w:r>
-        <w:t xml:space="preserve">“Sigurado kayo.”</w:t>
-      </w:r>
-    </w:p>
-    <w:p/>
-    <w:p>
-      <w:r>
-        <w:t xml:space="preserve">“Sigurado ako.”</w:t>
+        <w:t xml:space="preserve">“Sigurado kayo kanina.”</w:t>
+      </w:r>
+    </w:p>
+    <w:p/>
+    <w:p>
+      <w:r>
+        <w:t xml:space="preserve">“Sigurado ako kanina.”</w:t>
       </w:r>
     </w:p>
     <w:p/>
@@ -4977,7 +4977,7 @@
     <w:p/>
     <w:p>
       <w:r>
-        <w:t xml:space="preserve">At nang binanggit niya ang pangalan ni Joyce, ibinigay ko kay Joyce sa isang iglap ang ipinagkait ko kay Renée sa loob ng isang linggo. Siyempre alam ni Joyce ang tungkol sa semento. Nagbake siya sa tabi nito sa loob ng maraming taon. Gusto ko si Joyce. Kinuha niya ang walis ni Greta at winalis ang basag na salamin at ayaw tumanggap ng pasasalamat, at pinatawad ko na siya bago pa man matapos ni Renée ang pangungusap.</w:t>
+        <w:t xml:space="preserve">At nang binanggit niya ang pangalan ni Joyce, ibinigay ko kay Joyce sa isang iglap ang ipinagkait ko kay Renée sa loob ng isang linggo. Siyempre alam ni Joyce ang tungkol sa semento. Nagbake siya sa tabi nito sa loob ng maraming taon. Gusto ko si Joyce. Kinuha niya ang walis ni Greta at winalis ang basag na salamin at ayaw tumanggap ng pasasalamat, at inalis ko na siya sa hinala bago pa man matapos ni Renée ang pangungusap.</w:t>
       </w:r>
     </w:p>
     <w:p/>
@@ -5309,7 +5309,7 @@
     <w:p/>
     <w:p>
       <w:r>
-        <w:t xml:space="preserve">“Naalala ko na sinabi mo sa akin. Hindi mo binigyang-pansin.”</w:t>
+        <w:t xml:space="preserve">“Naaalala kong sinabi mo sa akin. Hindi mo binigyang-pansin.”</w:t>
       </w:r>
     </w:p>
     <w:p/>
@@ -5423,7 +5423,7 @@
     <w:p/>
     <w:p>
       <w:r>
-        <w:t xml:space="preserve">“Iyon ang pinaniniwalaan ko. Pagkatapos ay pinuntahan ni Doc ang kaniyang bodega noong Huwebes at walang maasim na base doon, at sinabi niya sa akin kung sino ang nagsasabi sa kaniya tungkol sa semento ni Greta.” Hindi na ako nagpatuloy doon, dahil nanumpa ako laban sa mga mukha para sa gabing ito. “Kaya naiwan ako sa papel. Ang polyeto ay borador muna ng imprenta sa counter ng isang tao bago pa man ito maging polyeto sa isang pisara. May nakakita roon. May nakabasa ng linggong iyon mula rito, at sumulat ng reklamo sa kondado para tumapat dito.”</w:t>
+        <w:t xml:space="preserve">“Iyon ang pinaniwalaan ko. Pagkatapos ay pinuntahan ni Doc ang kaniyang bodega noong Huwebes at walang maasim na base doon, at sinabi niya sa akin kung sino ang nagsasabi sa kaniya tungkol sa semento ni Greta.” Hindi na ako nagpatuloy doon, dahil nanumpa ako laban sa mga mukha para sa gabing ito. “Kaya naiwan ako sa papel. Ang polyeto ay borador muna ng imprenta sa counter ng isang tao bago pa man ito maging polyeto sa isang pisara. May nakakita roon. May nakabasa ng linggong iyon mula rito, at sumulat ng reklamo sa kondado para tumapat dito.”</w:t>
       </w:r>
     </w:p>
     <w:p/>
@@ -5458,7 +5458,7 @@
     <w:p/>
     <w:p>
       <w:r>
-        <w:t xml:space="preserve">Binuksan ni Olivia ang Yarn Tales tuwing Sabado ng umaga habang nakasalang ang takure para sa sinumang dadaan mula sa lansangan, at noong Sabado na iyon ay mas ginusto ko ang takure kaysa sa lana. Halos hindi ako nakatulog. Nanatili ang lamig buong magdamag, at ang hangin sa Evergreen Avenue ay maliwanag at tahimik. Nauna si Pip sa akin habang nakapalobo ang kanyang mga balahibo laban sa ginaw.</w:t>
+        <w:t xml:space="preserve">Binubuksan ni Olivia ang Yarn Tales tuwing Sabado ng umaga habang nakasalang ang takure para sa sinumang dadaan mula sa lansangan, at noong Sabado na iyon ay mas ginusto ko ang takure kaysa sa lana. Halos hindi ako nakatulog. Nanatili ang lamig buong magdamag, at ang hangin sa Evergreen Avenue ay maliwanag at tahimik. Nauna si Pip sa akin habang nakapalobo ang kanyang mga balahibo laban sa ginaw.</w:t>
       </w:r>
     </w:p>
     <w:p/>
@@ -5476,7 +5476,7 @@
     <w:p/>
     <w:p>
       <w:r>
-        <w:t xml:space="preserve">“Hindi ko sinabing nababaliw ako,” sabi ni Martha. “Ang sabi ko ay kakaiba.” Ibinaling niya ang telepono sa akin para makita ko ang tala ng tawag doon sa maliwanag na screen. “May tumawag sa akin kagabi, oras ng hapunan. Magalang. Pormal at propesyonal. Sinabi niyang tumatawag siya mula sa Wendt's Bakehouse sa kabilang bayan sa Bridgton, at dahil sarado ang Holly Jolly, masaya silang pupuno sa order ko sa Holly Jolly. Dalawang tsokolate-pecan at isang dosenang tinapay, handa sa Miyerkules bago ang Araw ng Pasasalamat.” Ibinaba niya ang telepono. “Iyon ang order ko. Hanggang sa huling tinapay.”</w:t>
+        <w:t xml:space="preserve">“Hindi ko sinabing nababaliw ako,” sabi ni Martha. “Ang sabi ko ay kakaiba.” Ibinaling niya ang telepono sa akin para makita ko ang tala ng tawag doon sa maliwanag na screen. “May babaeng tumawag sa akin kagabi, oras ng hapunan. Magalang. Pormal at propesyonal. Sinabi niyang tumatawag siya mula sa Wendt's Bakehouse sa kabilang bayan sa Bridgton, at dahil sarado ang Holly Jolly, masaya silang pupuno sa order ko sa Holly Jolly. Dalawang tsokolate-pecan at isang dosenang tinapay, handa sa Miyerkules bago ang Araw ng Pasasalamat.” Ibinaba niya ang telepono. “Iyon ang order ko. Hanggang sa huling tinapay.”</w:t>
       </w:r>
     </w:p>
     <w:p/>
@@ -5494,7 +5494,7 @@
     <w:p/>
     <w:p>
       <w:r>
-        <w:t xml:space="preserve">“Natanggap ko rin ang tawag na iyon,” sabi sa akin ni Ivy. “Pagkatapos na pagkatapos ng kay Martha. Parehong babae, sigurado ako. Alam niya ang pangalan ko, ang numero ko, at ang tatlong pie na kalabasa ko. Alam pa nga niyang hiniling ko kay Greta na huwag i-bake ang mga tinapay para sariwa kong magawa sa mismong araw.” Humihip siya sa ibabaw ng kanyang tasa. “Inisip ko na baka ibinigay ni Greta kay Joyce ang listahan niya. Para walang mapag-iwanan. Nagdala si Joyce sa kanya ng kaserol noong Lunes, nakita ko ang van sa labas. Baka nagkaayos na rin silang dalawa sa wakas.”</w:t>
+        <w:t xml:space="preserve">“Natanggap ko rin ang tawag na iyon,” sabi sa akin ni Ivy. “Pagkatapos na pagkatapos ng kay Martha. Parehong babae, halos sigurado ako. Alam niya ang pangalan ko, ang numero ko, at ang tatlong pie na kalabasa ko. Alam pa nga niyang hiniling ko kay Greta na huwag i-bake ang mga tinapay para sariwa kong magawa sa mismong araw.” Humihip siya sa ibabaw ng kanyang tasa. “Inisip ko na baka ibinigay ni Greta kay Joyce ang listahan niya. Para walang mapag-iwanan. Nagdala si Joyce sa kanya ng kaserol noong Lunes, nakita ko ang van sa labas. Baka nagkaayos na rin silang dalawa sa wakas.”</w:t>
       </w:r>
     </w:p>
     <w:p/>
@@ -5841,7 +5841,7 @@
     <w:p/>
     <w:p>
       <w:r>
-        <w:t xml:space="preserve">“Ang liham noong Agosto,” sabi ko. “Ang kompanyang gustong bumili sa tindahan mo. Naalala mo ba ang pangalan?”</w:t>
+        <w:t xml:space="preserve">“Ang liham noong Agosto,” sabi ko. “Ang kompanyang gustong bumili sa tindahan mo. Naaalala mo ba ang pangalan?”</w:t>
       </w:r>
     </w:p>
     <w:p/>
@@ -5853,7 +5853,7 @@
     <w:p/>
     <w:p>
       <w:r>
-        <w:t xml:space="preserve">“Itinapon ko sa basurahan, Jessica.” Patag at pagod ang boses ni Greta, at pagkaraan ng ilang saglit: “Stillwater. Stillwater yata. Naalala ko dahil parang pangalan ito ng punerarya, at sinabi ko iyon sa basurahan.”</w:t>
+        <w:t xml:space="preserve">“Itinapon ko sa basurahan, Jessica.” Patag at pagod ang boses ni Greta, at pagkaraan ng ilang saglit: “Stillwater. Stillwater kung ano man. Naaalala ko dahil parang pangalan ito ng punerarya, at sinabi ko iyon sa basurahan.”</w:t>
       </w:r>
     </w:p>
     <w:p/>
@@ -5865,7 +5865,7 @@
     <w:p/>
     <w:p>
       <w:r>
-        <w:t xml:space="preserve">“Sa Pelkey's, sa Lewiston. Lahat ng pakyawang panaderya sa gilid ng mga bundok na ito ay doon kumukuha.” Huminga siya nang malalim. “Si Joyce mismo ang nagbukas ng aming account doon noong unang taon, at dinala niya ito nang umalis siya, at hindi niya iyon pinalitan. Mas gugustuhin pa ni Joyce ang makipag-away sa tagapagtustos kaysa lumipat.” Isa pang buntong-hininga. “Huwag kang dadaan dito ngayon. At huwag mo rin akong kaawaan sa telepono. Hindi ko kaya.”</w:t>
+        <w:t xml:space="preserve">“Sa Pelkey's, sa Lewiston. Lahat ng pakyawang panaderya sa gilid ng mga bundok na ito ay doon kumukuha.” Huminga siya nang malalim. “Si Joyce mismo ang nagbukas ng aming account doon noong unang taon, at dinala niya ito nang umalis siya, at malamang hindi niya iyon pinalitan. Mas gugustuhin pa ni Joyce ang makipag-away sa tagapagtustos kaysa lumipat.” Isa pang buntong-hininga. “Huwag kang dadaan dito ngayon. At huwag mo rin akong kaawaan sa telepono. Hindi ko kaya.”</w:t>
       </w:r>
     </w:p>
     <w:p/>
@@ -5901,7 +5901,7 @@
     <w:p/>
     <w:p>
       <w:r>
-        <w:t xml:space="preserve">“Stillwater yata. Isang abogado ang sumulat kay Greta para sa kanila noong Agosto.”</w:t>
+        <w:t xml:space="preserve">“Stillwater kung ano man. Isang abogado ang sumulat kay Greta para sa kanila noong Agosto.”</w:t>
       </w:r>
     </w:p>
     <w:p/>
@@ -6003,7 +6003,7 @@
     <w:p/>
     <w:p>
       <w:r>
-        <w:t>Madilim na nang tumawid ako sa liwasan. Nagwawalis si Pete ng kusot patungo sa kanyang pintuan, nakabaling na ang karatula at may huling kostumer na umalis na may dalang pakete sa ilalim ng braso. Pinapasok niya ako at nagpatuloy sa pagwawalis.</w:t>
+        <w:t>Dumidilim na nang tumawid ako sa liwasan. Nagwawalis si Pete ng kusot patungo sa kanyang pintuan, nakabaling na ang karatula at may huling kostumer na umalis na may dalang pakete sa ilalim ng braso. Pinapasok niya ako at nagpatuloy sa pagwawalis.</w:t>
       </w:r>
     </w:p>
     <w:p/>
@@ -6015,7 +6015,7 @@
     <w:p/>
     <w:p>
       <w:r>
-        <w:t xml:space="preserve">“Tungkol ito sa isang van.” Inilagay ko ang printout sa kanyang bloke. “Sinabi ninyo sa akin na may nakaparadang van sa dulo malapit sa botika, na nakapatay ang mga ilaw.”</w:t>
+        <w:t xml:space="preserve">“Tungkol ito sa isang van.” Inilagay ko ang printout sa kanyang bloke. “Sinabi ninyo sa akin na may nakaparadang van sa dulo malapit sa parmasya, na nakapatay ang mga ilaw.”</w:t>
       </w:r>
     </w:p>
     <w:p/>
@@ -6081,7 +6081,7 @@
     <w:p/>
     <w:p>
       <w:r>
-        <w:t xml:space="preserve">“Nakakita si Doc ng maasim na base sa harina ni Greta,” sabi ko. “Ang uri na binibili ng panaderya para sa rye. May isang panaderya sa Bridgton na tumatawag sa mga kostumer ni Greta sa pangalan, inaalok silang sila na ang gagawa ng mga order sa Holly Jolly. At ang kompanyang sumulat noong Agosto para bilhin si Greta ay nakarehistro sa babaeng nagmamay-ari ng panaderyang iyon.” Huminga ako nang malalim bago itanong ang dahilan ng pagtawag ko. “Maaari mo bang malaman kung ang Pelkey's, sa Lewiston, ay nagdala ng maasim na base sa Wendt's Bakehouse ngayong taglagas?”</w:t>
+        <w:t xml:space="preserve">“Nakakita si Doc ng maasim na base sa harina ni Greta,” sabi ko. “Ang uri na binibili ng panaderya para sa rye. May isang panaderya sa Bridgton na tumatawag sa mga kostumer ni Greta sa pangalan, inaalok silang sila na ang gagawa ng mga order sa Holly Jolly. At ang kompanyang sumulat noong Agosto para bilhin ang tindahan ni Greta ay nakarehistro sa babaeng nagmamay-ari ng panaderyang iyon.” Huminga ako nang malalim bago itanong ang dahilan ng pagtawag ko. “Maaari mo bang malaman kung ang Pelkey's, sa Lewiston, ay nagdala ng maasim na base sa Wendt's Bakehouse ngayong taglagas?”</w:t>
       </w:r>
     </w:p>
     <w:p/>
@@ -6263,7 +6263,7 @@
     </w:p>
     <w:p>
       <w:r>
-        <w:t>May maayos na gatong na kalan si Noriko Tanaka sa kanyang maliit na opisina sa istasyon, at isang takure na may nayupi sa tagiliran ang tahimik na nakalagay sa ibabaw nito. Sinabi niyang papasok siya, araw man ng Linggo o hindi, at naroroon nga siya. Tumayo siya nang pumasok ako. Dumiretso si Pip sa kalan at biglang tumigil, dahil may isa pang ibon sa makintab na tagiliran ng takure, na nayuko nang wala sa ayos dahil sa yupi, at tumigil din ito.</w:t>
+        <w:t>May maayos na gatong na kalan si Noriko Tanaka sa kanyang maliit na opisina sa istasyon, at isang takure na may nayupi sa tagiliran ang tahimik na nakalagay sa ibabaw nito. Sinabi niyang papasok siya, araw man ng Linggo o hindi, at naroroon nga siya. Tumayo siya nang pumasok ako. Dumiretso si Pip sa kalan at biglang tumigil, dahil may isa pang ibon sa makintab na tagiliran ng takure, na baluktot ang anyo dahil sa yupi, at tumigil din ito.</w:t>
       </w:r>
     </w:p>
     <w:p>
@@ -6348,7 +6348,7 @@
     </w:p>
     <w:p>
       <w:r>
-        <w:t xml:space="preserve">“Gusto ko iyon. Kung saan ito nagmula ay malamang na totoo, hindi pa napatunayan.” Sumulat siya ng isang linya at ginuhitan ito sa ibaba. “At ang kahon na nakita ng bata. May ginto sa tatak, sabi mo.”</w:t>
+        <w:t xml:space="preserve">“Kakailanganin ko iyon. Kung saan ito nagmula ay malamang na totoo, hindi pa napatunayan.” Sumulat siya ng isang linya at ginuhitan ito sa ibaba. “At ang kahon na nakita ng bata. May ginto sa tatak, sabi mo.”</w:t>
       </w:r>
     </w:p>
     <w:p>
@@ -6661,7 +6661,7 @@
     <w:p/>
     <w:p>
       <w:r>
-        <w:t xml:space="preserve">“Naka-kadena ang tarangkahan na iyon ni Pete,” ani Greta. “Ang kandado niya ay nasa isang dulo at ang sa akin ay sa kabila. May dalawang susi ang sa akin. Ang isa ay nasa singsing ng susi ko. Ang isa naman ay ipinagawa ko para sa iyo noong taong binuksan namin ito, at kailanman ay hindi ko na hiningi pabalik.”</w:t>
+        <w:t xml:space="preserve">“Nakakadena ni Pete ang tarangkahang iyon,” ani Greta. “Ang kandado niya ay nasa isang dulo at ang sa akin ay sa kabila. May dalawang susi ang sa akin. Ang isa ay nasa singsing ng susi ko. Ang isa naman ay ipinagawa ko para sa iyo noong taong binuksan namin ito, at kailanman ay hindi ko na hiningi pabalik.”</w:t>
       </w:r>
     </w:p>
     <w:p/>
@@ -6763,7 +6763,7 @@
     <w:p/>
     <w:p>
       <w:r>
-        <w:t xml:space="preserve">“Hinayaan kitang umalis,” wika ni Greta sa huli, at nawala ang talim sa kanyang boses. “Totoo iyon. Ibibigay ko iyon sa iyo. Nag-away kami tungkol sa mga pugon, nag-away kami tungkol sa karatula, nag-away kami tungkol sa pagbubukas kung Linggo, at nang sinabi mong gusto mong umalis ay natuwa ako, patawarin ako ng Diyos, natuwa akong magkaroon ng isang kusina at isang paraan ng paggawa ng mga bagay dito. Sana ay ipinaglaban kitang manatili. Hindi ko ginawa. Akin iyon.” Huminga siya nang malalim. “At ang kard ay si Theo na humihingi sa akin ng isasali, at ako na isinulat ito sa counter sa pagitan ng mga kostumer nang walang iniisip sa aking isip. Hindi kita naisip. Akin din iyon.”</w:t>
+        <w:t xml:space="preserve">“Hinayaan kitang umalis,” wika ni Greta sa huli, at nawala ang talim sa kanyang boses. “Totoo iyon. Aaminin ko iyon. Nag-away kami tungkol sa mga pugon, nag-away kami tungkol sa karatula, nag-away kami tungkol sa pagbubukas kung Linggo, at nang sinabi mong gusto mong umalis ay natuwa ako, patawarin ako ng Diyos, natuwa akong magkaroon ng isang kusina at isang paraan ng paggawa ng mga bagay dito. Sana ay ipinaglaban kitang manatili. Hindi ko ginawa. Akin iyon.” Huminga siya nang malalim. “At ang kard ay si Theo na humihingi sa akin ng isasali, at ako na isinulat ito sa counter sa pagitan ng mga kostumer nang walang iniisip sa aking isip. Hindi kita naisip. Akin din iyon.”</w:t>
       </w:r>
     </w:p>
     <w:p/>
@@ -6847,7 +6847,7 @@
     <w:p/>
     <w:p>
       <w:r>
-        <w:t xml:space="preserve">“Kakailanganin ninyo ng abogado ngayon, Ginang Wendt,” aniya, nang hindi masama ang tono. “Karapatan ninyo iyon, at kukunin ko iyon, kung ako ang nasa posisyon ninyo. Ngunit magiging malinaw ako tungkol dito, para walang malito mamaya. Ang hawak ko ay talaan ng tagapagtustos na may pirma ninyo, pagtutugma ng isang kimiko, rehistro ng estado, isang lalaking nakakaalam ng inyong van, at dalawang babaeng tinawagan ng inyong panaderya na may mga order mula sa aklat na wala kayong karapatang basahin. Lahat ng ito ay nakasulat. Wala rito ang nangangailangan na umamin kayo sa anupaman.” Ibinaba niya ang panulat. “Anuman ang pinagsisisihan ninyo ngayong hapon, at sa palagay ko ay mayroon, hindi nito binabago ang kahit isang salita sa pahina. Sasampahan kayo ng kaso ngayong araw. Tawagan ang inyong abogado, bumalik kayo rito kasama siya pagsapit ng alas-sais, at gagawin namin ang natitira nang tahimik.”</w:t>
+        <w:t xml:space="preserve">“Kakailanganin ninyo ng abogado ngayon, Ginang Wendt,” aniya, nang hindi masama ang tono. “Karapatan ninyo iyon, at kukunin ko iyon, kung ako ang nasa posisyon ninyo. Ngunit magiging malinaw ako tungkol dito, para walang malito mamaya. Ang hawak ko ay talaan ng tagapagtustos na may pirma ninyo, pagtutugma ng isang kimiko, rehistro ng estado, isang lalaking nakakakilala sa inyong van, at dalawang babaeng tinawagan ng inyong panaderya na may mga order mula sa aklat na wala kayong karapatang basahin. Lahat ng ito ay nakasulat. Wala rito ang nangangailangan na umamin kayo sa anupaman.” Ibinaba niya ang panulat. “Anuman ang pinagsisisihan ninyo ngayong hapon, at sa palagay ko ay mayroon, hindi nito binabago ang kahit isang salita sa pahina. Sasampahan kayo ng kaso ngayong araw. Tawagan ang inyong abogado, bumalik kayo rito kasama siya pagsapit ng alas-sais, at gagawin namin ang natitira nang tahimik.”</w:t>
       </w:r>
     </w:p>
     <w:p/>
@@ -7080,7 +7080,7 @@
     <w:p/>
     <w:p>
       <w:r>
-        <w:t>Hinayaan niya itong mamayani sandali. Sa likod niya, inilagay isa-isa ng katulong ang mga financier sa lalagyan mula sa isang tray, nang hindi tumitingin sa aming dalawa.</w:t>
+        <w:t>Hinayaan niya itong mamayani sandali. Sa likod niya, inilalagay isa-isa ng katulong ang mga financier sa lalagyan mula sa isang tray, nang hindi tumitingin sa aming dalawa.</w:t>
       </w:r>
     </w:p>
     <w:p/>
@@ -7176,7 +7176,7 @@
     <w:p/>
     <w:p>
       <w:r>
-        <w:t xml:space="preserve">Baliktad na hinawakan ni Nick ang runner sa kanyang mga kamay at pinadaan ang kanyang hinlalaki sa kurba nito. “Nag-alok ba siya sa iyo ng kape sa pagkakataong ito?”</w:t>
+        <w:t xml:space="preserve">Binaligtad ni Nick ang runner sa kanyang mga kamay at pinadaan ang kanyang hinlalaki sa kurba nito. “Nag-alok ba siya sa iyo ng kape sa pagkakataong ito?”</w:t>
       </w:r>
     </w:p>
     <w:p/>
@@ -7223,7 +7223,7 @@
     <w:p/>
     <w:p>
       <w:r>
-        <w:t xml:space="preserve">Tiningnan ni Greta ang papel sa loob ng mahabang sandali, magkasalikop ang mga kamay. Ang huli mula sa kondado ay kulay dilaw. Pagkatapos ay umabot siya sa ilalim ng kaniyang lagayan, pinutulan si Varney ng isang hiwa ng tsokolate-pecan, at inilagay iyon sa kaniyang kamay. Wala siyang dapat patawarin dito. Siya ay ang lalaki lamang na ipinadala nila. Kinain niya ito habang nakatayo sa pintuan na nakatalikod sa lamig, hanggang sa huling mumo, bago umalis.</w:t>
+        <w:t xml:space="preserve">Tiningnan ni Greta ang papel sa loob ng mahabang sandali, magkasalikop ang mga kamay. Ang huli mula sa kondado ay kulay dilaw. Pagkatapos ay umabot siya sa ilalim ng kaniyang lagayan, pinutulan si Varney ng isang hiwa ng tsokolate-pecan, at inilagay iyon sa kaniyang kamay. Wala siyang kasalanang dapat patawarin. Siya ay ang lalaki lamang na ipinadala nila. Kinain niya ito habang nakatayo sa pintuan na nakatalikod sa lamig, hanggang sa huling mumo, bago umalis.</w:t>
       </w:r>
     </w:p>
     <w:p/>
@@ -7235,7 +7235,7 @@
     <w:p/>
     <w:p>
       <w:r>
-        <w:t>Kumalat iyon sa buong Frost Falls sa pagsapit ng tanghali nang kasimbilis ng pagkalat ng pag-aalinlangan, ngunit sa pagkakataong ito ay mainit ang pagtanggap. Hindi iyon ang kaniyang harina. Hindi kailanman naging harina niya iyon. Si Joyce Wendt pala iyon na taga-Bridgton, ang kaniyang dating kasosyo, ang nagdala ng tinapay sa Grange. Sinadya nitong sirain ang harina at nagsinungaling sa kondado upang ipasara siya, at nahuli siya ni Ginang Claus sa tulong ng isang penguin. Ang huling bahaging iyon ay lumaki nang kaunti sa pagkukuwento, at hinayaan ko na lamang. Nang umabot ito sa dulo ng Evergreen, pinagawa na si Pip sa mga gawaing hinding-hindi ko paniniwalaan.</w:t>
+        <w:t>Kumalat iyon sa buong Frost Falls sa pagsapit ng tanghali nang kasimbilis ng pagkalat ng pag-aalinlangan, ngunit sa pagkakataong ito ay mainit ang pagtanggap. Hindi ang kaniyang harina ang may sala. Kailanman ay hindi ang kaniyang harina. Si Joyce Wendt pala iyon na taga-Bridgton, ang kaniyang dating kasosyo, ang nagdala ng tinapay sa Grange. Sinadya nitong sirain ang harina at nagsinungaling sa kondado upang ipasara siya, at nahuli ito ni Ginang Claus sa tulong ng isang penguin. Ang huling bahaging iyon ay lumaki nang kaunti sa pagkukuwento, at hinayaan ko na lamang. Nang umabot ito sa dulo ng Evergreen, pinagawa na si Pip sa mga gawaing hinding-hindi ko paniniwalaan.</w:t>
       </w:r>
     </w:p>
     <w:p/>
@@ -7647,7 +7647,7 @@
     </w:p>
     <w:p>
       <w:r>
-        <w:t xml:space="preserve">“Hindi na ito kasya,” sinabi niya sa kahon, at sa silid. “Para magamit ito ng bata pagkalipas ng isang daang taon. Malamig din ang mga kamay niya. Lahat ay malamig dito.” Inilagay niya ito, maliit at pula laban sa kahon na sedro, sa tabi ng dalawang napakaliit na guwantes ni Bram at ng inilagay ko sa Grange, at umurong pabalik sa loob ng amerikana ni Martha.</w:t>
+        <w:t xml:space="preserve">“Hindi na ito kasya,” sinabi niya sa kahon, at sa silid. “Para magamit ito ng batang babae pagkalipas ng isang daang taon. Malamig din ang mga kamay niya. Lahat ay malamig dito.” Inilagay niya ito, maliit at pula laban sa kahon na sedro, sa tabi ng dalawang napakaliit na guwantes ni Bram at ng inilagay ko sa Grange, at umurong pabalik sa loob ng amerikana ni Martha.</w:t>
       </w:r>
     </w:p>
     <w:p>
@@ -7692,7 +7692,7 @@
     </w:p>
     <w:p>
       <w:r>
-        <w:t xml:space="preserve">Hindi ang kanyang mga tinapay na may koko. Alam na iyon ng buong bayan sa puso. Isinulat niya sa isang magandang kard ang tinapay na luya na dinala ng kanyang lola mula sa lumang bansa, ang sinabi niyang hinding-hindi niya ibinigay sa kahit kanino at walang balak na simulan ngayon. Pagkatapos ay tiniklop niya ito nang minsan at inilagay sa kahon na sedro. “Hayaan silang paghirapan ito tulad ng ginawa ko,” sabi niya nang tuyo sa nagtatawanang silid. “Sa pamamagitan ng pagiging pamilya, o sa pamamagitan ng paghahanap nito sa isang kahon.”</w:t>
+        <w:t xml:space="preserve">Hindi ang kanyang mga tinapay na may koko. Kabisado na iyon ng buong bayan. Isinulat niya sa isang magandang kard ang tinapay na luya na dinala ng kanyang lola mula sa lumang bansa, ang sinabi niyang hinding-hindi niya ibinigay sa kahit kanino at walang balak na simulan ngayon. Pagkatapos ay tiniklop niya ito nang minsan at inilagay sa kahon na sedro. “Hayaan silang paghirapan ito tulad ng ginawa ko,” sabi niya nang tuyo sa nagtatawanang silid. “Sa pamamagitan ng pagiging pamilya, o sa pamamagitan ng paghahanap nito sa isang kahon.”</w:t>
       </w:r>
     </w:p>
     <w:p>
@@ -7964,7 +7964,7 @@
     <w:p/>
     <w:p>
       <w:r>
-        <w:t>Naabutan ako ni Martha sa daan palabas, nag-iingay si Snowball sa bukong-bukong nito at si Emma Redfern ay lumulukso sa mga baitang ng beranda sa likod niya, namumula ang mga pisngi sa lamig at pagtakbo.</w:t>
+        <w:t>Naabutan ako ni Martha sa daan palabas, nag-iingay si Snowball sa kaniyang bukong-bukong at si Emma Redfern ay lumulukso sa mga baitang ng beranda sa likod niya, namumula ang mga pisngi sa lamig at pagtakbo.</w:t>
       </w:r>
     </w:p>
     <w:p/>
@@ -8036,7 +8036,7 @@
     <w:p/>
     <w:p>
       <w:r>
-        <w:t xml:space="preserve">“Mas malapit ito,” aniya. “Unti-unti itong lumalapit buong linggo, mas malapit tuwing gabi. Hindi ko alam kung bakit.” Itinagilid niya ang kamay ko sa ilalim ng sa kanya, pareho kaming nakapatag ang mga palad sa bato. “Tataas itong muli pagsapit ng umaga. Pero mas malapit ito sa apoy ngayong gabi kaysa kailanman, at gusto kong madama mo habang narito ito.”</w:t>
+        <w:t xml:space="preserve">“Mas malapit ito,” aniya. “Unti-unti itong lumalapit buong linggo, mas malapit tuwing gabi. Hindi ko alam kung bakit.” Binaligtad niya ang kamay ko sa ilalim ng sa kanya, pareho kaming nakapatag ang mga palad sa bato. “Tataas itong muli pagsapit ng umaga. Pero mas malapit ito sa apoy ngayong gabi kaysa kailanman, at gusto kong madama mo habang narito ito.”</w:t>
       </w:r>
     </w:p>
     <w:p/>
@@ -8054,7 +8054,7 @@
     <w:p/>
     <w:p>
       <w:r>
-        <w:t>Nanatiling mainit ang kamay ni Nick sa ibabaw ng akin sa bato, at bumaba ang niyebe. Naupo ako roon sa malapit sa dilim kasama ang aking asawa at ang aking penguin at ang isang apuyan na mas mainit kaysa sa nararapat. Ayokong mapunta sa ibang lugar sa malawak at malamig na mundong ito.</w:t>
+        <w:t>Nanatiling mainit ang kamay ni Nick sa ibabaw ng akin sa bato, at bumaba ang niyebe. Naupo ako roon sa halos-dilim kasama ang aking asawa at ang aking penguin at ang isang apuyan na mas mainit kaysa sa nararapat. Ayokong mapunta sa ibang lugar sa malawak at malamig na mundong ito.</w:t>
       </w:r>
     </w:p>
     <w:p/>
@@ -8100,17 +8100,17 @@
     </w:p>
     <w:p>
       <w:r>
-        <w:t xml:space="preserve">Ang pamana ng yumaong tiyahin ay nag-aalok ng paraan palabas — isang maalikabok na tindahan ng pagbubuklod ng aklat sa napakagandang bayan ng Pinecrest, pag-aari niyang ibenta at kalimutan. Pagkatapos ay bumagsak ang pangulo ng Historical Society sa Moonlight Masquerade Ball, habang hawak ang isang maliit na talaarawang katad, at hiniling ng sheriff kay Fiona na suriin iyon.</w:t>
-      </w:r>
-    </w:p>
-    <w:p>
-      <w:r>
-        <w:t>Sa sandaling hawakan niya ang aklat, ipinapakita nito sa kanya ang mga bagay na hindi dapat malaman ng anumang dokumento: takot, pagkakasala, isang nakatagong katotohanan. Ang Pinecrest, lumalabas, ay nagpapatakbo sa isang mahika na mas luma kaysa sa alindog nitong Victorian — at may gumagamit nito para pumatay.</w:t>
-      </w:r>
-    </w:p>
-    <w:p>
-      <w:r>
-        <w:t>Dumating si Fiona para ayusin ang isang ari-arian. Kakailanganin niyang ayusin ang isang pagpatay sa halip, gamit ang isang regalo na hindi niya maipaliwanag at hindi mapatunayan.</w:t>
+        <w:t xml:space="preserve">Ang pamana ng yumaong tiyahin ay nag-aalok ng paraan palabas — isang maalikabok na tindahan ng pagbubuklod ng aklat sa napakagandang bayan ng Pinecrest, pag-aari niyang ibenta at kalimutan. Pagkatapos ay bumabagsak ang pangulo ng Historical Society sa Moonlight Masquerade Ball, habang hawak ang isang maliit na talaarawang katad, at hinihiling ng sheriff kay Fiona na suriin iyon.</w:t>
+      </w:r>
+    </w:p>
+    <w:p>
+      <w:r>
+        <w:t>Sa sandaling hawakan niya ang aklat, ipinapakita nito sa kanya ang mga bagay na hindi dapat malaman ng anumang dokumento: takot, pagkakasala, isang nakatagong katotohanan. Ang Pinecrest, lumalabas, ay umaandar sa isang mahika na mas luma kaysa sa alindog nitong Victorian — at may gumagamit nito para pumatay.</w:t>
+      </w:r>
+    </w:p>
+    <w:p>
+      <w:r>
+        <w:t>Dumating si Fiona para ayusin ang isang ari-arian. Kakailanganin niyang ayusin ang isang pagpatay sa halip, gamit ang isang kakayahang hindi niya maipaliwanag at hindi mapatunayan.</w:t>
       </w:r>
     </w:p>
     <w:p>

</xml_diff>